<commit_message>
Update API contract to D2.4: remove solved issues, fix auth permissions, formalize language
- Move all FIXED items (D2.2, D2.3) to a separate gitignored CHANGELOG.md
- Remove 26 stale/duplicate paragraphs left over from prior versions
- Fix incorrect statement that school_admin has full read/write access;
  admin write access is now correctly documented as limited to enrolments
- Remove JWT references that contradicted the session-token architecture
- Rename cross-team section headings to be action-oriented per team
- Tighten informal language throughout (Getting Started, Auth, notes)
</commit_message>
<xml_diff>
--- a/API-CONTRACT.docx
+++ b/API-CONTRACT.docx
@@ -43,7 +43,7 @@
     </w:p>
     <w:p>
       <w:r>
-        <w:t>Current version: D2.3 (March 2026) -- updated with workpack-confirmed decisions on auth architecture, progress ownership, parent model, and data scoping.</w:t>
+        <w:t>Current version: D2.4 (March 2026).</w:t>
       </w:r>
     </w:p>
     <w:p>
@@ -71,7 +71,7 @@
     <w:p>
       <w:pPr/>
       <w:r>
-        <w:t>Wait ~15 seconds, then verify all services are healthy:</w:t>
+        <w:t>Allow approximately 15 seconds for services to initialize, then verify:</w:t>
       </w:r>
     </w:p>
     <w:p>
@@ -87,7 +87,7 @@
     <w:p>
       <w:pPr/>
       <w:r>
-        <w:t>Migrations and seeding happen automatically -- no extra commands needed.</w:t>
+        <w:t>Migrations and seed data are applied automatically on first start.</w:t>
       </w:r>
     </w:p>
     <w:p>
@@ -163,7 +163,7 @@
     <w:p>
       <w:pPr/>
       <w:r>
-        <w:t>Tokens are forwarded: When Dashboard Service calls Experience/Enrolment, it forwards your bearer token. One token works across the whole chain.</w:t>
+        <w:t>Token forwarding: The Dashboard Service forwards the caller's bearer token when making internal requests to the Experience and Enrolment services. A single token authenticates across all services.</w:t>
       </w:r>
     </w:p>
     <w:p>
@@ -529,7 +529,7 @@
         <w:pStyle w:val="ListBullet"/>
       </w:pPr>
       <w:r>
-        <w:t>Valid token mapping to a user with role school_admin or school_teacher grants full read/write access. Students (role=student) have read-only access scoped to their own data. Parents (role=parent) have read-only access scoped to their linked child's data via the parent_of column. Students and parents receive 403 Forbidden on write attempts (POST, PUT, PATCH, DELETE).</w:t>
+        <w:t>Valid token mapping to a user with role school_teacher grants full read/write access to experiences and cohorts. Users with role school_admin have read access to all data and write access limited to enrolment operations (enrolling and removing students from cohorts). Students (role=student) have read-only access scoped to their own data. Parents (role=parent) have read-only access scoped to their linked child's data via the parent_of column. Students and parents receive 403 Forbidden on write attempts.</w:t>
       </w:r>
       <w:r>
         <w:rPr>
@@ -558,7 +558,7 @@
         <w:rPr>
           <w:sz w:val="20"/>
         </w:rPr>
-        <w:t>Integration dependency: This is mock auth only. Per the project workpacks, the production auth model uses session tokens (not JWT). Team Quebec's Auth Service creates sessions in a database table (sessions: id, user_id, token, expires_at). The API Gateway (Role A) validates session tokens on incoming requests and propagates the authenticated user's identity to downstream services. Delta's services will not need to call Quebec per-request — the gateway handles validation centrally. See the "Integration Requests" section below for details.</w:t>
+        <w:t>Integration dependency: Authentication is currently mocked. The production architecture uses session tokens validated by the API Gateway (Role A). Team Quebec's Auth Service manages session records (sessions: id, user_id, token, expires_at). The gateway validates tokens on incoming requests and propagates user identity to downstream services. Delta does not validate tokens directly. See the "Integration Requests" section for details.</w:t>
       </w:r>
     </w:p>
     <w:p>
@@ -14698,81 +14698,11 @@
       </w:r>
     </w:p>
     <w:p>
-      <w:pPr/>
-      <w:r>
-        <w:t>15. [All] COPPA CONSENT: Not addressed in any workpack or the codebase. If students are under 13, parental consent tracking may be legally required.</w:t>
-      </w:r>
-    </w:p>
-    <w:p>
-      <w:pPr/>
-      <w:r>
-        <w:t>14. [Romeo] DUAL ERROR FORMATS: Standard Delta errors use {error: true, message, code}. Laravel validation errors use {message, errors: {field: [...]}}. Romeo must handle both formats.</w:t>
-      </w:r>
-    </w:p>
-    <w:p>
-      <w:pPr/>
-      <w:r>
-        <w:t>13. [Romeo] NO REAL-TIME NOTIFICATIONS: Delta dispatches internal Laravel events (StudentEnrolled, StudentRemoved) but has no external webhook, SSE, or polling mechanism. Romeo must poll for changes.</w:t>
-      </w:r>
-    </w:p>
-    <w:p>
-      <w:pPr/>
-      <w:r>
-        <w:t>12. [Romeo] NO PARENT CHILDREN ENDPOINT: No API endpoint returns which children a parent is linked to. Romeo cannot build a "Select Child" dropdown without this.</w:t>
-      </w:r>
-    </w:p>
-    <w:p>
-      <w:pPr/>
-      <w:r>
-        <w:t>11. [Romeo] THREE STUDENT DETAIL ENDPOINTS: Dashboard (/dashboard/students/{id}), Enrolment (/enrolments/students/{id}), and Experience (/experiences/{id}/students/{id}) return different data shapes for the same student. Romeo needs guidance on which is canonical for the student-facing view.</w:t>
-      </w:r>
-    </w:p>
-    <w:p>
-      <w:pPr/>
-      <w:r>
-        <w:t>10. [Papa] COURSE HIERARCHY DEPTH: Delta's CourseDataProviderInterface returns Course → Block (2 levels). Workpacks define Course → Block → Node → ActivityCard (4 levels). Papa must clarify whether Delta should expect nested nodes/cards in the block response or fetch them via separate endpoints.</w:t>
-      </w:r>
-    </w:p>
-    <w:p>
-      <w:pPr/>
-      <w:r>
-        <w:t>9. [Papa] BLOCK TYPE ENUM: Mock uses only "lesson" and "challenge". Workpacks reference 10 activity card types. Delta needs the authoritative list of valid block type values from Papa.</w:t>
-      </w:r>
-    </w:p>
-    <w:p>
-      <w:pPr/>
-      <w:r>
-        <w:t>8. [Papa] COURSE LIFECYCLE EVENTS: No mechanism exists for Papa to notify Delta when a course is renamed or deleted. Delta stores course_id as a plain integer (not a foreign key). Stale references will cause null course names in API responses.</w:t>
-      </w:r>
-    </w:p>
-    <w:p>
-      <w:pPr/>
-      <w:r>
-        <w:t>7. [Quebec] USERS TABLE OWNERSHIP: In production, Quebec owns user management. Current setup uses a shared PostgreSQL database. The production approach (shared DB vs event sync vs API calls) must be decided. Delta queries the users table on every request via SchoolScope.</w:t>
-      </w:r>
-    </w:p>
-    <w:p>
-      <w:pPr/>
-      <w:r>
-        <w:t>6. [Quebec] SCHOOL ONBOARDING: Delta has no POST /schools endpoint and no event listener for new schools. Karl owns onboarding per workpacks, but the mechanism for school records appearing in Delta's DB is undefined.</w:t>
-      </w:r>
-    </w:p>
-    <w:p>
-      <w:pPr/>
-      <w:r>
-        <w:t>5. [Quebec] ROLE ENUM: Role values are now documented above (see "Role Enum" section). Quebec must use exact case-sensitive strings. Adding new roles requires Delta coordination.</w:t>
-      </w:r>
-    </w:p>
-    <w:p>
-      <w:pPr/>
-      <w:r>
-        <w:t>4. [Quebec] PARENT MODEL TRANSITION: Codebase uses parent_of FK (single child per parent). Workpacks confirm parent_student_links table (many-to-many). Migration plan undefined — who owns the table, what columns, does Delta need a migration to drop parent_of?</w:t>
-      </w:r>
-    </w:p>
-    <w:p>
-      <w:pPr/>
-      <w:r>
-        <w:t>3. [Quebec] AUTH PROPAGATION MECHANISM: The API contract states the gateway validates session tokens, but does not specify how user identity is propagated to downstream services. Options: (a) trusted headers (X-User-Id, X-User-Role, X-School-Id), (b) short-lived internal JWT, (c) forward session token with shared sessions table. Quebec must decide and Delta must build matching middleware. BLOCKING for production auth.</w:t>
+      <w:pPr>
+        <w:pStyle w:val="Heading2"/>
+      </w:pPr>
+      <w:r>
+        <w:t>Open Items Requiring Cross-Team Resolution</w:t>
       </w:r>
     </w:p>
     <w:p>
@@ -14780,19 +14710,31 @@
         <w:pStyle w:val="Heading3"/>
       </w:pPr>
       <w:r>
-        <w:t>OPEN — Requires Cross-Team Discussion</w:t>
-      </w:r>
-    </w:p>
-    <w:p>
-      <w:pPr/>
-      <w:r>
-        <w:t>2. [Papa] StudentProgressProviderInterface methods getPosCoverage() and getEngagementRates() accepted Eloquent Collection objects, making it impossible for external services to implement. FIXED — refactored to accept array of {id, name} pairs.</w:t>
-      </w:r>
-    </w:p>
-    <w:p>
-      <w:pPr/>
-      <w:r>
-        <w:t>1. [Romeo] experience_id was missing from cohort_assignments in GET /enrolments response. FIXED — now included alongside experience_name.</w:t>
+        <w:t>Requires Matt (Role A) — Architectural Decisions</w:t>
+      </w:r>
+    </w:p>
+    <w:p>
+      <w:pPr>
+        <w:pStyle w:val="Normal"/>
+      </w:pPr>
+      <w:r>
+        <w:t>Delta requires this decision before production auth middleware can be implemented.</w:t>
+      </w:r>
+    </w:p>
+    <w:p>
+      <w:pPr>
+        <w:pStyle w:val="Normal"/>
+      </w:pPr>
+      <w:r>
+        <w:t xml:space="preserve">7. SHARED DB vs PER-SERVICE DB: All three Delta services currently share one PostgreSQL database. Matt and Karl must decide: (a) keep shared DB with schema-level isolation, (b) separate databases per service with data sync, or (c) another approach. This affects how Quebec’s user management integrates with Delta’s read-heavy user queries.</w:t>
+      </w:r>
+    </w:p>
+    <w:p>
+      <w:pPr>
+        <w:pStyle w:val="Normal"/>
+      </w:pPr>
+      <w:r>
+        <w:t xml:space="preserve">8. INTER-SERVICE EVENT PATTERN: Delta dispatches internal Laravel events (StudentEnrolled, StudentRemoved) for its own Observer pattern. For cross-service communication (e.g., notifying Papa when a cohort is activated, or receiving course updates from Papa), Matt must decide: REST webhooks, message queue (RabbitMQ/SQS), or database polling. This blocks items 12 and 16 below.</w:t>
       </w:r>
     </w:p>
     <w:p>
@@ -14800,13 +14742,95 @@
         <w:pStyle w:val="Heading3"/>
       </w:pPr>
       <w:r>
-        <w:t>FIXED This Release (D2.2)</w:t>
-      </w:r>
-    </w:p>
-    <w:p>
-      <w:pPr/>
-      <w:r>
-        <w:t>The following issues were identified during a cross-team integration simulation. Items marked FIXED have been resolved in the current codebase. Items marked OPEN require discussion or decisions from the responsible team.</w:t>
+        <w:t>Requires Karl / Team Quebec — Auth &amp; User Management</w:t>
+      </w:r>
+    </w:p>
+    <w:p>
+      <w:pPr>
+        <w:pStyle w:val="Normal"/>
+      </w:pPr>
+      <w:r>
+        <w:t xml:space="preserve">9. PARENT MODEL TRANSITION: Delta currently uses parent_of FK on users table (one child per parent). Karl’s canonical schema defines parent_student_links table (many-to-many). Quebec must provide: (a) table schema for parent_student_links, (b) migration timeline, (c) whether COPPA consent is tracked in this table. Delta will update EnrolmentController’s parent scoping logic when the link table is available.</w:t>
+      </w:r>
+    </w:p>
+    <w:p>
+      <w:pPr>
+        <w:pStyle w:val="Normal"/>
+      </w:pPr>
+      <w:r>
+        <w:t xml:space="preserve">10. SCHOOL ONBOARDING FLOW: Delta has no POST /schools endpoint. Karl owns onboarding per workpacks, but the mechanism for new school records appearing in Delta’s database is undefined. Delta’s SchoolScope silently returns empty results for unknown school_ids, so a missing school won’t error — it just looks empty.</w:t>
+      </w:r>
+    </w:p>
+    <w:p>
+      <w:pPr>
+        <w:pStyle w:val="Normal"/>
+      </w:pPr>
+      <w:r>
+        <w:t xml:space="preserve">11. USERS TABLE OWNERSHIP: Quebec owns user CRUD in production. Delta queries the users table on nearly every request (Auth::user(), SchoolScope, student lookups). If the production architecture separates databases, Delta needs either read-only access to a synced users table or a Quebec API endpoint for user resolution. This must be decided alongside item 7.</w:t>
+      </w:r>
+    </w:p>
+    <w:p>
+      <w:pPr>
+        <w:pStyle w:val="Normal"/>
+      </w:pPr>
+      <w:r>
+        <w:t xml:space="preserve">12. PARENT CHILDREN ENDPOINT: No API endpoint returns which children a parent user is linked to. Romeo needs GET /users/me/children or similar for a "Select Child" dropdown. Quebec owns the parent–student relationship data; Delta can proxy this once Quebec’s endpoint exists.</w:t>
+      </w:r>
+    </w:p>
+    <w:p>
+      <w:pPr>
+        <w:pStyle w:val="Heading3"/>
+      </w:pPr>
+      <w:r>
+        <w:t>Requires Team Papa — Course Service Integration</w:t>
+      </w:r>
+    </w:p>
+    <w:p>
+      <w:pPr>
+        <w:pStyle w:val="Normal"/>
+      </w:pPr>
+      <w:r>
+        <w:t xml:space="preserve">13. COURSE LIFECYCLE EVENTS: No mechanism exists for Papa to notify Delta when a course is renamed, archived, or deleted. Delta stores course_id as a plain integer in experience_courses. If Papa deletes a course, Delta’s API returns "Unknown" for the course name. Needs: webhook/event from Papa when courses change, or a "soft delete with archival" policy. Depends on item 8 (event pattern).</w:t>
+      </w:r>
+    </w:p>
+    <w:p>
+      <w:pPr>
+        <w:pStyle w:val="Normal"/>
+      </w:pPr>
+      <w:r>
+        <w:t xml:space="preserve">14. COURSE HIERARCHY DEPTH: Delta’s CourseDataProviderInterface returns Course → Block (2 levels). Workpacks define Course → Block → Node → ActivityCard (4 levels). Papa must clarify: (a) should Delta’s mock add Node and ActivityCard levels now, or (b) will the real provider return a flat blocks array and let the frontend fetch deeper levels directly from Papa?</w:t>
+      </w:r>
+    </w:p>
+    <w:p>
+      <w:pPr>
+        <w:pStyle w:val="Heading3"/>
+      </w:pPr>
+      <w:r>
+        <w:t>Requires Eva — Legal/Compliance</w:t>
+      </w:r>
+    </w:p>
+    <w:p>
+      <w:pPr>
+        <w:pStyle w:val="Normal"/>
+      </w:pPr>
+      <w:r>
+        <w:t xml:space="preserve">15. COPPA CONSENT: Not addressed in any workpack or the codebase. If the platform serves students under 13 (primary school), COPPA or equivalent regulations may require verifiable parental consent before storing student data. Eva needs to advise whether consent tracking is required, and if so, which service owns it.</w:t>
+      </w:r>
+    </w:p>
+    <w:p>
+      <w:pPr>
+        <w:pStyle w:val="Heading3"/>
+      </w:pPr>
+      <w:r>
+        <w:t>Internal Delta (No External Dependency)</w:t>
+      </w:r>
+    </w:p>
+    <w:p>
+      <w:pPr>
+        <w:pStyle w:val="Normal"/>
+      </w:pPr>
+      <w:r>
+        <w:t xml:space="preserve">16. THREE STUDENT DETAIL ENDPOINTS: GET /dashboard/students/{id}, GET /enrolments/students/{id}, and GET /experiences/{id}/students/{id} return different data shapes for the same student. This is an internal design cleanup — consider consolidating or clearly documenting which endpoint serves which use case.</w:t>
       </w:r>
     </w:p>
     <w:p>
@@ -14814,15 +14838,15 @@
         <w:pStyle w:val="Heading2"/>
       </w:pPr>
       <w:r>
-        <w:t>Cross-Team Integration Issues (March 20, 2026)</w:t>
-      </w:r>
-    </w:p>
-    <w:p>
-      <w:pPr>
-        <w:pStyle w:val="Normal"/>
-      </w:pPr>
-      <w:r>
-        <w:t xml:space="preserve">Identified during cross-team integration simulation (March 20, 2026) where Teams Romeo, Papa, and Quebec attempted to build integration code against Delta’s API.</w:t>
+        <w:rPr>
+          <w:color w:val="222222"/>
+        </w:rPr>
+        <w:t>Integration Requests -- What We Need From Other Teams</w:t>
+      </w:r>
+    </w:p>
+    <w:p>
+      <w:r>
+        <w:t>This section documents the external data that Team Delta currently mocks, organized by responsible team. Each item specifies the interface defined in our codebase, the response shape required, and which Delta endpoints depend on it.</w:t>
       </w:r>
     </w:p>
     <w:p>
@@ -14830,206 +14854,6 @@
         <w:pStyle w:val="Heading3"/>
       </w:pPr>
       <w:r>
-        <w:t xml:space="preserve">FIXED in D2.2</w:t>
-      </w:r>
-    </w:p>
-    <w:p>
-      <w:pPr>
-        <w:pStyle w:val="Normal"/>
-      </w:pPr>
-      <w:r>
-        <w:t xml:space="preserve">1. [Romeo] experience_id was missing from cohort_assignments in GET /enrolments response. Now included in both enrolment overview and student detail.</w:t>
-      </w:r>
-    </w:p>
-    <w:p>
-      <w:pPr>
-        <w:pStyle w:val="Normal"/>
-      </w:pPr>
-      <w:r>
-        <w:t xml:space="preserve">2. [Papa] StudentProgressProviderInterface accepted Eloquent Collection&lt;User&gt;, blocking external implementation. Refactored to accept array of {id, name} pairs.</w:t>
-      </w:r>
-    </w:p>
-    <w:p>
-      <w:pPr>
-        <w:pStyle w:val="Heading3"/>
-      </w:pPr>
-      <w:r>
-        <w:t xml:space="preserve">FIXED in D2.3</w:t>
-      </w:r>
-    </w:p>
-    <w:p>
-      <w:pPr>
-        <w:pStyle w:val="Normal"/>
-      </w:pPr>
-      <w:r>
-        <w:t xml:space="preserve">3. [Papa] Block type mock was wrong — blocks had type: "lesson"|"challenge" but canonical schema says blocks have status: "locked"|"active"|"complete". The 10 activity card types exist at the ActivityCard level (inside Nodes), not at Block level. Mock data corrected.</w:t>
-      </w:r>
-    </w:p>
-    <w:p>
-      <w:pPr>
-        <w:pStyle w:val="Normal"/>
-      </w:pPr>
-      <w:r>
-        <w:t xml:space="preserve">4. [Romeo] Dual error formats — standard Delta errors used {error, message, code} but Laravel validation errors used {message, errors} without the error flag or code. Added ValidationException renderer to all 3 services so ALL errors now use {error: true, message, code, errors?} envelope.</w:t>
-      </w:r>
-    </w:p>
-    <w:p>
-      <w:pPr>
-        <w:pStyle w:val="Normal"/>
-      </w:pPr>
-      <w:r>
-        <w:t xml:space="preserve">5. [Romeo/Papa/Quebec] School Admin permissions were too broad — admin had full write access to experiences, cohorts, and enrolments. Per the authoritative Roles PDF, School Admin can ONLY "add/remove students from cohorts." Experience CRUD and cohort management are now restricted to School Teacher. Enrolment operations (enrol/remove) remain open to both admin and teacher.</w:t>
-      </w:r>
-    </w:p>
-    <w:p>
-      <w:pPr>
-        <w:pStyle w:val="Heading3"/>
-      </w:pPr>
-      <w:r>
-        <w:t xml:space="preserve">OPEN — Needs Matt (Role A) — Architectural Decisions</w:t>
-      </w:r>
-    </w:p>
-    <w:p>
-      <w:pPr>
-        <w:pStyle w:val="Normal"/>
-      </w:pPr>
-      <w:r>
-        <w:t xml:space="preserve">6. AUTH PROPAGATION MECHANISM: Delta’s current MockAuthMiddleware maps bearer tokens to seeded users. For production, Matt must decide how user identity propagates from Quebec’s auth service to Delta’s microservices. Delta proposes trusted headers (X-User-Id, X-User-Role, X-School-Id) set by the API gateway after JWT validation. Matt needs to confirm or specify the alternative. Blocked: Delta cannot build real auth middleware without this decision.</w:t>
-      </w:r>
-    </w:p>
-    <w:p>
-      <w:pPr>
-        <w:pStyle w:val="Normal"/>
-      </w:pPr>
-      <w:r>
-        <w:t xml:space="preserve">7. SHARED DB vs PER-SERVICE DB: All three Delta services currently share one PostgreSQL database. Matt and Karl must decide: (a) keep shared DB with schema-level isolation, (b) separate databases per service with data sync, or (c) another approach. This affects how Quebec’s user management integrates with Delta’s read-heavy user queries.</w:t>
-      </w:r>
-    </w:p>
-    <w:p>
-      <w:pPr>
-        <w:pStyle w:val="Normal"/>
-      </w:pPr>
-      <w:r>
-        <w:t xml:space="preserve">8. INTER-SERVICE EVENT PATTERN: Delta dispatches internal Laravel events (StudentEnrolled, StudentRemoved) for its own Observer pattern. For cross-service communication (e.g., notifying Papa when a cohort is activated, or receiving course updates from Papa), Matt must decide: REST webhooks, message queue (RabbitMQ/SQS), or database polling. This blocks items 12 and 16 below.</w:t>
-      </w:r>
-    </w:p>
-    <w:p>
-      <w:pPr>
-        <w:pStyle w:val="Heading3"/>
-      </w:pPr>
-      <w:r>
-        <w:t xml:space="preserve">OPEN — Needs Karl / Team Quebec — Auth &amp; User Management</w:t>
-      </w:r>
-    </w:p>
-    <w:p>
-      <w:pPr>
-        <w:pStyle w:val="Normal"/>
-      </w:pPr>
-      <w:r>
-        <w:t xml:space="preserve">9. PARENT MODEL TRANSITION: Delta currently uses parent_of FK on users table (one child per parent). Karl’s canonical schema defines parent_student_links table (many-to-many). Quebec must provide: (a) table schema for parent_student_links, (b) migration timeline, (c) whether COPPA consent is tracked in this table. Delta will update EnrolmentController’s parent scoping logic when the link table is available.</w:t>
-      </w:r>
-    </w:p>
-    <w:p>
-      <w:pPr>
-        <w:pStyle w:val="Normal"/>
-      </w:pPr>
-      <w:r>
-        <w:t xml:space="preserve">10. SCHOOL ONBOARDING FLOW: Delta has no POST /schools endpoint. Karl owns onboarding per workpacks, but the mechanism for new school records appearing in Delta’s database is undefined. Delta’s SchoolScope silently returns empty results for unknown school_ids, so a missing school won’t error — it just looks empty.</w:t>
-      </w:r>
-    </w:p>
-    <w:p>
-      <w:pPr>
-        <w:pStyle w:val="Normal"/>
-      </w:pPr>
-      <w:r>
-        <w:t xml:space="preserve">11. USERS TABLE OWNERSHIP: Quebec owns user CRUD in production. Delta queries the users table on nearly every request (Auth::user(), SchoolScope, student lookups). If the production architecture separates databases, Delta needs either read-only access to a synced users table or a Quebec API endpoint for user resolution. This must be decided alongside item 7.</w:t>
-      </w:r>
-    </w:p>
-    <w:p>
-      <w:pPr>
-        <w:pStyle w:val="Normal"/>
-      </w:pPr>
-      <w:r>
-        <w:t xml:space="preserve">12. PARENT CHILDREN ENDPOINT: No API endpoint returns which children a parent user is linked to. Romeo needs GET /users/me/children or similar for a "Select Child" dropdown. Quebec owns the parent–student relationship data; Delta can proxy this once Quebec’s endpoint exists.</w:t>
-      </w:r>
-    </w:p>
-    <w:p>
-      <w:pPr>
-        <w:pStyle w:val="Heading3"/>
-      </w:pPr>
-      <w:r>
-        <w:t xml:space="preserve">OPEN — Needs Team Papa — Course Service Integration</w:t>
-      </w:r>
-    </w:p>
-    <w:p>
-      <w:pPr>
-        <w:pStyle w:val="Normal"/>
-      </w:pPr>
-      <w:r>
-        <w:t xml:space="preserve">13. COURSE LIFECYCLE EVENTS: No mechanism exists for Papa to notify Delta when a course is renamed, archived, or deleted. Delta stores course_id as a plain integer in experience_courses. If Papa deletes a course, Delta’s API returns "Unknown" for the course name. Needs: webhook/event from Papa when courses change, or a "soft delete with archival" policy. Depends on item 8 (event pattern).</w:t>
-      </w:r>
-    </w:p>
-    <w:p>
-      <w:pPr>
-        <w:pStyle w:val="Normal"/>
-      </w:pPr>
-      <w:r>
-        <w:t xml:space="preserve">14. COURSE HIERARCHY DEPTH: Delta’s CourseDataProviderInterface returns Course → Block (2 levels). Workpacks define Course → Block → Node → ActivityCard (4 levels). Papa must clarify: (a) should Delta’s mock add Node and ActivityCard levels now, or (b) will the real provider return a flat blocks array and let the frontend fetch deeper levels directly from Papa?</w:t>
-      </w:r>
-    </w:p>
-    <w:p>
-      <w:pPr>
-        <w:pStyle w:val="Heading3"/>
-      </w:pPr>
-      <w:r>
-        <w:t xml:space="preserve">OPEN — Needs Eva — Legal/Compliance</w:t>
-      </w:r>
-    </w:p>
-    <w:p>
-      <w:pPr>
-        <w:pStyle w:val="Normal"/>
-      </w:pPr>
-      <w:r>
-        <w:t xml:space="preserve">15. COPPA CONSENT: Not addressed in any workpack or the codebase. If the platform serves students under 13 (primary school), COPPA or equivalent regulations may require verifiable parental consent before storing student data. Eva needs to advise whether consent tracking is required, and if so, which service owns it.</w:t>
-      </w:r>
-    </w:p>
-    <w:p>
-      <w:pPr>
-        <w:pStyle w:val="Heading3"/>
-      </w:pPr>
-      <w:r>
-        <w:t xml:space="preserve">OPEN — Internal Delta (No External Dependency)</w:t>
-      </w:r>
-    </w:p>
-    <w:p>
-      <w:pPr>
-        <w:pStyle w:val="Normal"/>
-      </w:pPr>
-      <w:r>
-        <w:t xml:space="preserve">16. THREE STUDENT DETAIL ENDPOINTS: GET /dashboard/students/{id}, GET /enrolments/students/{id}, and GET /experiences/{id}/students/{id} return different data shapes for the same student. This is an internal design cleanup — consider consolidating or clearly documenting which endpoint serves which use case.</w:t>
-      </w:r>
-    </w:p>
-    <w:p>
-      <w:pPr>
-        <w:pStyle w:val="Heading2"/>
-      </w:pPr>
-      <w:r>
-        <w:rPr>
-          <w:color w:val="222222"/>
-        </w:rPr>
-        <w:t>Integration Requests -- What We Need From Other Teams</w:t>
-      </w:r>
-    </w:p>
-    <w:p>
-      <w:r>
-        <w:t>This section documents the external data that Team Delta currently mocks or stubs, organized by the team responsible for providing it. Each item specifies the mock class we would replace, the interface already defined in our codebase, the response shape we need, and which of our endpoints depend on it.</w:t>
-      </w:r>
-    </w:p>
-    <w:p>
-      <w:pPr>
-        <w:pStyle w:val="Heading3"/>
-      </w:pPr>
-      <w:r>
         <w:rPr>
           <w:color w:val="333333"/>
         </w:rPr>
@@ -15054,7 +14878,7 @@
     </w:p>
     <w:p>
       <w:r>
-        <w:t>What we currently mock: MockCourseDataProvider in experience-service/app/Services/MockCourseDataProvider.php, which returns 5 hardcoded courses with 1-5 blocks each. Note: Delta's mock uses a flat Course → Block structure with block fields (id, name, type). The canonical data hierarchy from Papa's workpack is deeper: Course → Block → Node → Activity Card (10 types). Block types in the mock ("lesson", "challenge") are development simplifications. When Papa's real API is available, the response shape for blocks will likely include nested nodes and activity cards.</w:t>
+        <w:t>What we currently mock: MockCourseDataProvider (experience-service/app/Services/MockCourseDataProvider.php) returns 5 hardcoded courses with 1–5 blocks each. Delta's mock uses a flat Course → Block structure. The canonical hierarchy is Course → Block → Node → Activity Card. Block types in the mock are development simplifications; the real response shape from Papa will include nested nodes and activity cards.</w:t>
       </w:r>
     </w:p>
     <w:p>
@@ -15557,7 +15381,7 @@
     </w:p>
     <w:p>
       <w:r>
-        <w:t>We need per-student progress information: courses completed, courses in progress, completion percentage, and blocks completed. Workpacks confirm: Papa's Course Service scope explicitly includes "course progress tracking" and "course progress calculation." Papa Sub-Pack P1 owns enrollment and progress; Sub-Pack P3 owns card completion tracking.</w:t>
+        <w:t>Delta requires per-student progress data: courses completed, courses in progress, completion percentage, and blocks completed. Papa's Course Service scope includes course progress tracking and calculation.</w:t>
       </w:r>
     </w:p>
     <w:p>
@@ -17115,7 +16939,7 @@
         <w:pStyle w:val="Heading4"/>
       </w:pPr>
       <w:r>
-        <w:t>1. Real Session-Token Authentication (Confirmed by Workpacks)</w:t>
+        <w:t>1. Real Session-Token Authentication</w:t>
       </w:r>
     </w:p>
     <w:p>
@@ -17141,7 +16965,7 @@
         <w:pStyle w:val="ListBullet"/>
       </w:pPr>
       <w:r>
-        <w:t>The JWT/token format and signing mechanism so we can verify tokens.</w:t>
+        <w:t>The mechanism by which user identity is propagated to downstream services (e.g., trusted headers, internal JWT, or shared session table).</w:t>
       </w:r>
     </w:p>
     <w:p>
@@ -17149,7 +16973,7 @@
         <w:pStyle w:val="ListBullet"/>
       </w:pPr>
       <w:r>
-        <w:t>An endpoint or mechanism to validate a token and extract the user's identity.</w:t>
+        <w:t>Confirmation of the session token payload or headers that Delta's middleware should read.</w:t>
       </w:r>
     </w:p>
     <w:p>
@@ -17317,66 +17141,49 @@
         <w:rPr>
           <w:b/>
         </w:rPr>
-        <w:t>What we would replace:</w:t>
-      </w:r>
-      <w:r>
-        <w:t xml:space="preserve"> The </w:t>
-      </w:r>
+        <w:t>Integration path: Delta's MockAuthMiddleware in all three services will be replaced with production middleware that reads authenticated user identity from gateway-injected headers or tokens.</w:t>
+      </w:r>
+      <w:r/>
       <w:r>
         <w:rPr>
           <w:rFonts w:ascii="Consolas" w:hAnsi="Consolas"/>
           <w:color w:val="444444"/>
           <w:sz w:val="19"/>
         </w:rPr>
-        <w:t>MockAuthMiddleware</w:t>
-      </w:r>
-      <w:r>
-        <w:t xml:space="preserve"> in all three services (</w:t>
-      </w:r>
+      </w:r>
+      <w:r/>
       <w:r>
         <w:rPr>
           <w:rFonts w:ascii="Consolas" w:hAnsi="Consolas"/>
           <w:color w:val="444444"/>
           <w:sz w:val="19"/>
         </w:rPr>
-        <w:t>dashboard-service</w:t>
-      </w:r>
-      <w:r>
-        <w:t xml:space="preserve">, </w:t>
-      </w:r>
+      </w:r>
+      <w:r/>
       <w:r>
         <w:rPr>
           <w:rFonts w:ascii="Consolas" w:hAnsi="Consolas"/>
           <w:color w:val="444444"/>
           <w:sz w:val="19"/>
         </w:rPr>
-        <w:t>experience-service</w:t>
-      </w:r>
-      <w:r>
-        <w:t xml:space="preserve">, </w:t>
-      </w:r>
+      </w:r>
+      <w:r/>
       <w:r>
         <w:rPr>
           <w:rFonts w:ascii="Consolas" w:hAnsi="Consolas"/>
           <w:color w:val="444444"/>
           <w:sz w:val="19"/>
         </w:rPr>
-        <w:t>enrolment-service</w:t>
-      </w:r>
-      <w:r>
-        <w:t xml:space="preserve">) would be replaced with a </w:t>
-      </w:r>
+      </w:r>
+      <w:r/>
       <w:r>
         <w:rPr>
           <w:rFonts w:ascii="Consolas" w:hAnsi="Consolas"/>
           <w:color w:val="444444"/>
           <w:sz w:val="19"/>
         </w:rPr>
-        <w:t>JwtAuthMiddleware</w:t>
-      </w:r>
-      <w:r>
-        <w:t xml:space="preserve"> that validates the token against your signing key or verification endpoint.</w:t>
-      </w:r>
+      </w:r>
+      <w:r/>
     </w:p>
     <w:p>
       <w:r>
@@ -17516,7 +17323,7 @@
         <w:pStyle w:val="Heading4"/>
       </w:pPr>
       <w:r>
-        <w:t>3. Open Questions for Quebec (Partially Resolved by Workpacks)</w:t>
+        <w:t>3. Open Questions for Quebec</w:t>
       </w:r>
     </w:p>
     <w:p>
@@ -18469,22 +18276,17 @@
         <w:rPr>
           <w:b/>
         </w:rPr>
-        <w:t>Note:</w:t>
-      </w:r>
-      <w:r>
-        <w:t xml:space="preserve"> Since both test tokens map to </w:t>
-      </w:r>
+        <w:t>All test tokens map to school_id = 1. Cross-school isolation can be verified by seeding a second school with its own token.</w:t>
+      </w:r>
+      <w:r/>
       <w:r>
         <w:rPr>
           <w:rFonts w:ascii="Consolas" w:hAnsi="Consolas"/>
           <w:color w:val="444444"/>
           <w:sz w:val="19"/>
         </w:rPr>
-        <w:t>school_id = 1</w:t>
-      </w:r>
-      <w:r>
-        <w:t>, all test data belongs to school 1. Cross-school isolation can be verified by seeding a second school with its own token in tests.</w:t>
-      </w:r>
+      </w:r>
+      <w:r/>
     </w:p>
     <w:sectPr>
       <w:pgSz w:w="12240" w:h="15840"/>

</xml_diff>

<commit_message>
Update API contract with hatchloom_teacher and hatchloom_admin roles
Add new platform-level tokens to the auth table, update role enums to
include all six canonical roles, and mark school_id as nullable for
platform roles that have no school affiliation.
</commit_message>
<xml_diff>
--- a/API-CONTRACT.docx
+++ b/API-CONTRACT.docx
@@ -194,7 +194,8 @@
     </w:p>
     <w:p>
       <w:r>
-        <w:t>Currently, authentication is mocked. Four hardcoded tokens are recognized:</w:t>
+        <w:rPr/>
+        <w:t>Currently, authentication is mocked. Six hardcoded tokens are recognized:</w:t>
       </w:r>
     </w:p>
     <w:tbl>
@@ -460,6 +461,90 @@
           <w:p>
             <w:r>
               <w:t>1</w:t>
+            </w:r>
+          </w:p>
+        </w:tc>
+      </w:tr>
+      <w:tr>
+        <w:tc>
+          <w:tcPr>
+            <w:tcW w:type="dxa" w:w="2351"/>
+          </w:tcPr>
+          <w:p>
+            <w:r>
+              <w:t>`test-hatchloom-teacher-token`</w:t>
+            </w:r>
+          </w:p>
+        </w:tc>
+        <w:tc>
+          <w:tcPr>
+            <w:tcW w:type="dxa" w:w="2351"/>
+          </w:tcPr>
+          <w:p>
+            <w:r>
+              <w:t>15</w:t>
+            </w:r>
+          </w:p>
+        </w:tc>
+        <w:tc>
+          <w:tcPr>
+            <w:tcW w:type="dxa" w:w="2351"/>
+          </w:tcPr>
+          <w:p>
+            <w:r>
+              <w:t>`hatchloom_teacher`</w:t>
+            </w:r>
+          </w:p>
+        </w:tc>
+        <w:tc>
+          <w:tcPr>
+            <w:tcW w:type="dxa" w:w="2351"/>
+          </w:tcPr>
+          <w:p>
+            <w:r>
+              <w:t>null</w:t>
+            </w:r>
+          </w:p>
+        </w:tc>
+      </w:tr>
+      <w:tr>
+        <w:tc>
+          <w:tcPr>
+            <w:tcW w:type="dxa" w:w="2351"/>
+          </w:tcPr>
+          <w:p>
+            <w:r>
+              <w:t>`test-hatchloom-admin-token`</w:t>
+            </w:r>
+          </w:p>
+        </w:tc>
+        <w:tc>
+          <w:tcPr>
+            <w:tcW w:type="dxa" w:w="2351"/>
+          </w:tcPr>
+          <w:p>
+            <w:r>
+              <w:t>16</w:t>
+            </w:r>
+          </w:p>
+        </w:tc>
+        <w:tc>
+          <w:tcPr>
+            <w:tcW w:type="dxa" w:w="2351"/>
+          </w:tcPr>
+          <w:p>
+            <w:r>
+              <w:t>`hatchloom_admin`</w:t>
+            </w:r>
+          </w:p>
+        </w:tc>
+        <w:tc>
+          <w:tcPr>
+            <w:tcW w:type="dxa" w:w="2351"/>
+          </w:tcPr>
+          <w:p>
+            <w:r>
+              <w:t>null</w:t>
             </w:r>
           </w:p>
         </w:tc>
@@ -16890,67 +16975,7 @@
         <w:pStyle w:val="ListBullet"/>
       </w:pPr>
       <w:r>
-        <w:t xml:space="preserve">The token payload should include (or allow us to derive): </w:t>
-      </w:r>
-      <w:r>
-        <w:rPr>
-          <w:rFonts w:ascii="Consolas" w:hAnsi="Consolas"/>
-          <w:sz w:val="19"/>
-        </w:rPr>
-        <w:t>user_id</w:t>
-      </w:r>
-      <w:r>
-        <w:t xml:space="preserve">, </w:t>
-      </w:r>
-      <w:r>
-        <w:rPr>
-          <w:rFonts w:ascii="Consolas" w:hAnsi="Consolas"/>
-          <w:sz w:val="19"/>
-        </w:rPr>
-        <w:t>role</w:t>
-      </w:r>
-      <w:r>
-        <w:t xml:space="preserve"> (one of </w:t>
-      </w:r>
-      <w:r>
-        <w:rPr>
-          <w:rFonts w:ascii="Consolas" w:hAnsi="Consolas"/>
-          <w:sz w:val="19"/>
-        </w:rPr>
-        <w:t>school_admin</w:t>
-      </w:r>
-      <w:r>
-        <w:t xml:space="preserve">, </w:t>
-      </w:r>
-      <w:r>
-        <w:rPr>
-          <w:rFonts w:ascii="Consolas" w:hAnsi="Consolas"/>
-          <w:sz w:val="19"/>
-        </w:rPr>
-        <w:t>school_teacher</w:t>
-      </w:r>
-      <w:r>
-        <w:t xml:space="preserve">, </w:t>
-      </w:r>
-      <w:r>
-        <w:rPr>
-          <w:rFonts w:ascii="Consolas" w:hAnsi="Consolas"/>
-          <w:sz w:val="19"/>
-        </w:rPr>
-        <w:t>student</w:t>
-      </w:r>
-      <w:r>
-        <w:t xml:space="preserve">), and </w:t>
-      </w:r>
-      <w:r>
-        <w:rPr>
-          <w:rFonts w:ascii="Consolas" w:hAnsi="Consolas"/>
-          <w:sz w:val="19"/>
-        </w:rPr>
-        <w:t>school_id</w:t>
-      </w:r>
-      <w:r>
-        <w:t>.</w:t>
+        <w:t>The token payload should include (or allow us to derive): user_id, role (one of school_admin, school_teacher, student, parent, hatchloom_teacher, hatchloom_admin), and school_id (nullable for platform-level roles).</w:t>
       </w:r>
     </w:p>
     <w:p>
@@ -17159,7 +17184,7 @@
         <w:pStyle w:val="ListBullet"/>
       </w:pPr>
       <w:r>
-        <w:t>role (varchar, not null) -- One of: school_admin, school_teacher, student, parent</w:t>
+        <w:t>role (varchar, not null) -- One of: school_admin, school_teacher, student, parent, hatchloom_teacher, hatchloom_admin</w:t>
       </w:r>
     </w:p>
     <w:p>
@@ -17167,7 +17192,7 @@
         <w:pStyle w:val="ListBullet"/>
       </w:pPr>
       <w:r>
-        <w:t>school_id (bigint FK, not null) -- References schools.id</w:t>
+        <w:t>school_id (bigint FK, nullable) -- References schools.id. Null for platform-level roles (hatchloom_teacher, hatchloom_admin).</w:t>
       </w:r>
     </w:p>
     <w:p>

</xml_diff>

<commit_message>
Add course catalogue endpoint, seed data variety, and API contract D2.5
- Add GET /api/school/courses endpoint (CourseController) exposing the
  course catalogue via the existing strategy pattern provider
- Add 3rd experience (Creative Problem Solving, draft status) and 4th
  cohort (Cohort D, completed) to seed data for lifecycle variety
- Add cross-cohort enrolment (Student 3 in Cohort C) for multi-cohort demos
- Fix API contract: PoS coverage, engagement, contents, credential, and
  health check response shapes now match actual code output
- Label all response examples as "Example response" for clarity
- Scope .gitignore package.json exclusion to *-service/ directories only
</commit_message>
<xml_diff>
--- a/API-CONTRACT.docx
+++ b/API-CONTRACT.docx
@@ -67,7 +67,7 @@
     </w:p>
     <w:p>
       <w:r>
-        <w:t>Current version: D2.4 (March 2026).</w:t>
+        <w:t>Current version: D2.5 (March 2026).</w:t>
       </w:r>
     </w:p>
     <w:p>
@@ -104,7 +104,7 @@
         <w:pStyle w:val="ListBullet"/>
       </w:pPr>
       <w:r>
-        <w:t>2 experiences: Business Foundations, Tech Explorers (with 5 courses total)</w:t>
+        <w:t>3 experiences: Business Foundations (active), Tech Explorers (active), Creative Problem Solving (draft) -- with 5 courses total</w:t>
       </w:r>
     </w:p>
     <w:p>
@@ -112,16 +112,12 @@
         <w:pStyle w:val="ListBullet"/>
       </w:pPr>
       <w:r>
-        <w:t>3 cohorts: Cohort A (active, 6 students), Cohort B (</w:t>
+        <w:t>4 cohorts: Cohort A (active, 6 students), Cohort B (not_started), Cohort C (active, 3 students), Cohort D (completed, 4 students)</w:t>
       </w:r>
       <w:proofErr w:type="spellStart"/>
-      <w:r>
-        <w:t>not_started</w:t>
-      </w:r>
+      <w:r/>
       <w:proofErr w:type="spellEnd"/>
-      <w:r>
-        <w:t>), Cohort C (active, 2 students)</w:t>
-      </w:r>
+      <w:r/>
     </w:p>
     <w:p>
       <w:pPr>
@@ -1082,10 +1078,7 @@
           </w:tcPr>
           <w:p>
             <w:r>
-              <w:rPr>
-                <w:sz w:val="20"/>
-              </w:rPr>
-              <w:t>Screens 301/302 -- experience CRUD and detail views</w:t>
+              <w:t>Screens 301/302 -- experience CRUD, detail views, and course catalogue</w:t>
             </w:r>
           </w:p>
         </w:tc>
@@ -1389,7 +1382,7 @@
         <w:rPr>
           <w:b/>
         </w:rPr>
-        <w:t>Response (200):</w:t>
+        <w:t>Example response (200):</w:t>
       </w:r>
     </w:p>
     <w:p>
@@ -1445,7 +1438,16 @@
           <w:color w:val="333333"/>
           <w:sz w:val="18"/>
         </w:rPr>
-        <w:t xml:space="preserve">  "timestamp": "2026-03-12T14:30:00+00:00"</w:t>
+        <w:t xml:space="preserve">  "timestamp": "2026-03-12T14:30:00+00:00",</w:t>
+      </w:r>
+    </w:p>
+    <w:p>
+      <w:pPr>
+        <w:shd w:val="clear" w:color="auto" w:fill="F5F5F5"/>
+        <w:spacing w:after="0" w:line="240" w:lineRule="auto"/>
+      </w:pPr>
+      <w:r>
+        <w:t>  "database": "connected"</w:t>
       </w:r>
     </w:p>
     <w:p>
@@ -1808,7 +1810,7 @@
         <w:rPr>
           <w:b/>
         </w:rPr>
-        <w:t>Response (200):</w:t>
+        <w:t>Example response (200):</w:t>
       </w:r>
     </w:p>
     <w:p>
@@ -3356,7 +3358,7 @@
         <w:rPr>
           <w:b/>
         </w:rPr>
-        <w:t>Response (201):</w:t>
+        <w:t>Example response (201):</w:t>
       </w:r>
     </w:p>
     <w:p>
@@ -3634,7 +3636,7 @@
         <w:rPr>
           <w:b/>
         </w:rPr>
-        <w:t>Error (422) -- Validation failure:</w:t>
+        <w:t>Example error (422) -- Validation failure:</w:t>
       </w:r>
     </w:p>
     <w:p>
@@ -3890,7 +3892,7 @@
         <w:rPr>
           <w:b/>
         </w:rPr>
-        <w:t>Response (200):</w:t>
+        <w:t>Example response (200):</w:t>
       </w:r>
     </w:p>
     <w:p>
@@ -4235,7 +4237,7 @@
         <w:rPr>
           <w:b/>
         </w:rPr>
-        <w:t>Error (404):</w:t>
+        <w:t>Example error (404):</w:t>
       </w:r>
     </w:p>
     <w:p>
@@ -4795,7 +4797,7 @@
         <w:rPr>
           <w:b/>
         </w:rPr>
-        <w:t>Response (200):</w:t>
+        <w:t>Example response (200):</w:t>
       </w:r>
     </w:p>
     <w:p>
@@ -5156,7 +5158,7 @@
         <w:rPr>
           <w:b/>
         </w:rPr>
-        <w:t>Response (200):</w:t>
+        <w:t>Example response (200):</w:t>
       </w:r>
     </w:p>
     <w:p>
@@ -5234,7 +5236,7 @@
         <w:rPr>
           <w:b/>
         </w:rPr>
-        <w:t>Error (409) -- Invalid state transition:</w:t>
+        <w:t>Example error (409) -- Invalid state transition:</w:t>
       </w:r>
     </w:p>
     <w:p>
@@ -5442,7 +5444,7 @@
         <w:rPr>
           <w:b/>
         </w:rPr>
-        <w:t>Response (200):</w:t>
+        <w:t>Example response (200):</w:t>
       </w:r>
     </w:p>
     <w:p>
@@ -5520,7 +5522,7 @@
         <w:rPr>
           <w:b/>
         </w:rPr>
-        <w:t>Error (409) -- Invalid state transition:</w:t>
+        <w:t>Example error (409) -- Invalid state transition:</w:t>
       </w:r>
     </w:p>
     <w:p>
@@ -6148,7 +6150,7 @@
         <w:rPr>
           <w:b/>
         </w:rPr>
-        <w:t>Response (200):</w:t>
+        <w:t>Example response (200):</w:t>
       </w:r>
     </w:p>
     <w:p>
@@ -7575,7 +7577,7 @@
         <w:rPr>
           <w:b/>
         </w:rPr>
-        <w:t>Response (201):</w:t>
+        <w:t>Example response (201):</w:t>
       </w:r>
     </w:p>
     <w:p>
@@ -7765,7 +7767,7 @@
         <w:rPr>
           <w:b/>
         </w:rPr>
-        <w:t>Error (422) -- Cohort not active:</w:t>
+        <w:t>Example error (422) -- Cohort not active:</w:t>
       </w:r>
     </w:p>
     <w:p>
@@ -7843,7 +7845,7 @@
         <w:rPr>
           <w:b/>
         </w:rPr>
-        <w:t>Error (422) -- Duplicate:</w:t>
+        <w:t>Example error (422) -- Duplicate:</w:t>
       </w:r>
     </w:p>
     <w:p>
@@ -7922,7 +7924,7 @@
         <w:rPr>
           <w:b/>
         </w:rPr>
-        <w:t>Error (422) -- At capacity:</w:t>
+        <w:t>Example error (422) -- At capacity:</w:t>
       </w:r>
     </w:p>
     <w:p>
@@ -8157,7 +8159,7 @@
         <w:rPr>
           <w:b/>
         </w:rPr>
-        <w:t>Response (200):</w:t>
+        <w:t>Example response (200):</w:t>
       </w:r>
     </w:p>
     <w:p>
@@ -8207,7 +8209,7 @@
         <w:rPr>
           <w:b/>
         </w:rPr>
-        <w:t>Error (404) -- Enrolment not found:</w:t>
+        <w:t>Example error (404) -- Enrolment not found:</w:t>
       </w:r>
     </w:p>
     <w:p>
@@ -8364,7 +8366,7 @@
         <w:rPr>
           <w:b/>
         </w:rPr>
-        <w:t>Response (200):</w:t>
+        <w:t>Example response (200):</w:t>
       </w:r>
     </w:p>
     <w:p>
@@ -9070,7 +9072,7 @@
         <w:rPr>
           <w:b/>
         </w:rPr>
-        <w:t>Response (200):</w:t>
+        <w:t>Example response (200):</w:t>
       </w:r>
     </w:p>
     <w:p>
@@ -9472,7 +9474,7 @@
           <w:color w:val="333333"/>
           <w:sz w:val="18"/>
         </w:rPr>
-        <w:t xml:space="preserve">    "</w:t>
+        <w:t xml:space="preserve">    "total_earned": 2,</w:t>
       </w:r>
       <w:proofErr w:type="spellStart"/>
       <w:proofErr w:type="gramStart"/>
@@ -9482,7 +9484,6 @@
           <w:color w:val="333333"/>
           <w:sz w:val="18"/>
         </w:rPr>
-        <w:t>total</w:t>
       </w:r>
       <w:proofErr w:type="gramEnd"/>
       <w:r>
@@ -9491,7 +9492,6 @@
           <w:color w:val="333333"/>
           <w:sz w:val="18"/>
         </w:rPr>
-        <w:t>_earned</w:t>
       </w:r>
       <w:proofErr w:type="spellEnd"/>
       <w:r>
@@ -9500,48 +9500,66 @@
           <w:color w:val="333333"/>
           <w:sz w:val="18"/>
         </w:rPr>
-        <w:t>": 0,</w:t>
-      </w:r>
-      <w:r>
-        <w:rPr>
-          <w:rFonts w:ascii="Consolas" w:hAnsi="Consolas"/>
-          <w:color w:val="333333"/>
-          <w:sz w:val="18"/>
-        </w:rPr>
+      </w:r>
+      <w:r>
+        <w:rPr>
+          <w:rFonts w:ascii="Consolas" w:hAnsi="Consolas"/>
+          <w:color w:val="333333"/>
+          <w:sz w:val="18"/>
+        </w:rPr>
+      </w:r>
+      <w:proofErr w:type="spellStart"/>
+      <w:r>
+        <w:rPr>
+          <w:rFonts w:ascii="Consolas" w:hAnsi="Consolas"/>
+          <w:color w:val="333333"/>
+          <w:sz w:val="18"/>
+        </w:rPr>
+      </w:r>
+      <w:proofErr w:type="spellEnd"/>
+      <w:r>
+        <w:rPr>
+          <w:rFonts w:ascii="Consolas" w:hAnsi="Consolas"/>
+          <w:color w:val="333333"/>
+          <w:sz w:val="18"/>
+        </w:rPr>
+      </w:r>
+    </w:p>
+    <w:p>
+      <w:pPr>
+        <w:shd w:val="clear" w:color="auto" w:fill="F5F5F5"/>
+        <w:spacing w:after="0" w:line="240" w:lineRule="auto"/>
+      </w:pPr>
+      <w:proofErr w:type="spellStart"/>
+      <w:proofErr w:type="gramStart"/>
+      <w:proofErr w:type="gramEnd"/>
+      <w:proofErr w:type="spellEnd"/>
+      <w:proofErr w:type="spellStart"/>
+      <w:proofErr w:type="spellEnd"/>
+      <w:r>
+        <w:t xml:space="preserve">    "in_progress": 1,</w:t>
+      </w:r>
+    </w:p>
+    <w:p>
+      <w:pPr>
+        <w:shd w:val="clear" w:color="auto" w:fill="F5F5F5"/>
+        <w:spacing w:after="0" w:line="240" w:lineRule="auto"/>
+      </w:pPr>
+      <w:r>
+        <w:rPr>
+          <w:rFonts w:ascii="Consolas" w:hAnsi="Consolas"/>
+          <w:color w:val="333333"/>
+          <w:sz w:val="18"/>
+        </w:rPr>
+        <w:t xml:space="preserve">    "details": [</w:t>
         <w:br/>
-        <w:t xml:space="preserve">    "</w:t>
-      </w:r>
-      <w:proofErr w:type="spellStart"/>
-      <w:r>
-        <w:rPr>
-          <w:rFonts w:ascii="Consolas" w:hAnsi="Consolas"/>
-          <w:color w:val="333333"/>
-          <w:sz w:val="18"/>
-        </w:rPr>
-        <w:t>in_progress</w:t>
-      </w:r>
-      <w:proofErr w:type="spellEnd"/>
-      <w:r>
-        <w:rPr>
-          <w:rFonts w:ascii="Consolas" w:hAnsi="Consolas"/>
-          <w:color w:val="333333"/>
-          <w:sz w:val="18"/>
-        </w:rPr>
-        <w:t>": 0,</w:t>
-      </w:r>
-    </w:p>
-    <w:p>
-      <w:pPr>
-        <w:shd w:val="clear" w:color="auto" w:fill="F5F5F5"/>
-        <w:spacing w:after="0" w:line="240" w:lineRule="auto"/>
-      </w:pPr>
-      <w:r>
-        <w:rPr>
-          <w:rFonts w:ascii="Consolas" w:hAnsi="Consolas"/>
-          <w:color w:val="333333"/>
-          <w:sz w:val="18"/>
-        </w:rPr>
-        <w:t xml:space="preserve">    "details": []</w:t>
+        <w:t xml:space="preserve">      { "id": 1, "name": "Entrepreneurial Thinking Foundations", "type": "credential", "status": "earned", "earned_at": "2026-02-15" },</w:t>
+        <w:br/>
+        <w:t xml:space="preserve">      { "id": 2, "name": "Financial Literacy Completion", "type": "certificate", "status": "earned", "earned_at": "2026-03-05" },</w:t>
+        <w:br/>
+        <w:t xml:space="preserve">      { "id": 3, "name": "Marketing Basics Badge", "type": "badge", "status": "in_progress", "earned_at": null }</w:t>
+        <w:br/>
+        <w:t xml:space="preserve">    ]</w:t>
       </w:r>
     </w:p>
     <w:p>
@@ -9577,7 +9595,7 @@
         <w:rPr>
           <w:b/>
         </w:rPr>
-        <w:t>Error (404):</w:t>
+        <w:t>Example error (404):</w:t>
       </w:r>
     </w:p>
     <w:p>
@@ -10492,7 +10510,7 @@
         <w:rPr>
           <w:b/>
         </w:rPr>
-        <w:t>Response (200):</w:t>
+        <w:t>Example response (200):</w:t>
       </w:r>
     </w:p>
     <w:p>
@@ -10548,7 +10566,25 @@
           <w:color w:val="333333"/>
           <w:sz w:val="18"/>
         </w:rPr>
-        <w:t xml:space="preserve">  "timestamp": "2026-03-12T14:30:00+00:00"</w:t>
+        <w:t xml:space="preserve">  "timestamp": "2026-03-12T14:30:00+00:00",</w:t>
+      </w:r>
+    </w:p>
+    <w:p>
+      <w:pPr>
+        <w:shd w:val="clear" w:color="auto" w:fill="F5F5F5"/>
+        <w:spacing w:after="0" w:line="240" w:lineRule="auto"/>
+      </w:pPr>
+      <w:r>
+        <w:t>  "database": "connected",</w:t>
+      </w:r>
+    </w:p>
+    <w:p>
+      <w:pPr>
+        <w:shd w:val="clear" w:color="auto" w:fill="F5F5F5"/>
+        <w:spacing w:after="0" w:line="240" w:lineRule="auto"/>
+      </w:pPr>
+      <w:r>
+        <w:t>  "downstream": { "enrolment-service": "reachable" }</w:t>
       </w:r>
     </w:p>
     <w:p>
@@ -10843,7 +10879,7 @@
         <w:rPr>
           <w:b/>
         </w:rPr>
-        <w:t>Response (200):</w:t>
+        <w:t>Example response (200):</w:t>
       </w:r>
     </w:p>
     <w:p>
@@ -11828,7 +11864,7 @@
         <w:rPr>
           <w:b/>
         </w:rPr>
-        <w:t>Response (201):</w:t>
+        <w:t>Example response (201):</w:t>
       </w:r>
     </w:p>
     <w:p>
@@ -12130,7 +12166,7 @@
         <w:rPr>
           <w:b/>
         </w:rPr>
-        <w:t>Error (422) -- Invalid course IDs:</w:t>
+        <w:t>Example error (422) -- Invalid course IDs:</w:t>
       </w:r>
     </w:p>
     <w:p>
@@ -12389,7 +12425,7 @@
         <w:rPr>
           <w:b/>
         </w:rPr>
-        <w:t>Response (200):</w:t>
+        <w:t>Example response (200):</w:t>
       </w:r>
     </w:p>
     <w:p>
@@ -13287,7 +13323,7 @@
         <w:rPr>
           <w:b/>
         </w:rPr>
-        <w:t>Response (200):</w:t>
+        <w:t>Example response (200):</w:t>
       </w:r>
     </w:p>
     <w:p>
@@ -13526,7 +13562,7 @@
         <w:rPr>
           <w:b/>
         </w:rPr>
-        <w:t>Response (200):</w:t>
+        <w:t>Example response (200):</w:t>
       </w:r>
     </w:p>
     <w:p>
@@ -13871,7 +13907,7 @@
         <w:rPr>
           <w:b/>
         </w:rPr>
-        <w:t>Response (200):</w:t>
+        <w:t>Example response (200):</w:t>
       </w:r>
     </w:p>
     <w:p>
@@ -14907,7 +14943,7 @@
         <w:rPr>
           <w:b/>
         </w:rPr>
-        <w:t>Response (200):</w:t>
+        <w:t>Example response (200):</w:t>
       </w:r>
     </w:p>
     <w:p>
@@ -15349,7 +15385,7 @@
         <w:rPr>
           <w:b/>
         </w:rPr>
-        <w:t>Error (404):</w:t>
+        <w:t>Example error (404):</w:t>
       </w:r>
     </w:p>
     <w:p>
@@ -16058,7 +16094,7 @@
         <w:rPr>
           <w:b/>
         </w:rPr>
-        <w:t>Error (404):</w:t>
+        <w:t>Example error (404):</w:t>
       </w:r>
     </w:p>
     <w:p>
@@ -16244,8 +16280,7 @@
         <w:rPr>
           <w:b/>
         </w:rPr>
-        <w:lastRenderedPageBreak/>
-        <w:t>Response (200):</w:t>
+        <w:t>Example response (200):</w:t>
       </w:r>
     </w:p>
     <w:p>
@@ -16441,7 +16476,7 @@
           <w:color w:val="333333"/>
           <w:sz w:val="18"/>
         </w:rPr>
-        <w:t xml:space="preserve">          "type": "lesson"</w:t>
+        <w:t xml:space="preserve">          "status": "active"</w:t>
       </w:r>
     </w:p>
     <w:p>
@@ -16506,7 +16541,7 @@
         <w:spacing w:after="0" w:line="240" w:lineRule="auto"/>
       </w:pPr>
       <w:r>
-        <w:t xml:space="preserve">          "type": "lesson"</w:t>
+        <w:t xml:space="preserve">          "status": "active"</w:t>
       </w:r>
     </w:p>
     <w:p>
@@ -16584,7 +16619,7 @@
         <w:rPr>
           <w:b/>
         </w:rPr>
-        <w:t>Error (404):</w:t>
+        <w:t>Example error (404):</w:t>
       </w:r>
     </w:p>
     <w:p>
@@ -16791,7 +16826,7 @@
         <w:rPr>
           <w:b/>
         </w:rPr>
-        <w:t>Response (200):</w:t>
+        <w:t>Example response (200):</w:t>
       </w:r>
     </w:p>
     <w:p>
@@ -17270,7 +17305,7 @@
         <w:rPr>
           <w:b/>
         </w:rPr>
-        <w:t>Error (404):</w:t>
+        <w:t>Example error (404):</w:t>
       </w:r>
     </w:p>
     <w:p>
@@ -17519,6 +17554,174 @@
     </w:p>
     <w:p>
       <w:pPr>
+        <w:pStyle w:val="Normal"/>
+      </w:pPr>
+      <w:r>
+        <w:t xml:space="preserve">Integration dependency: Course data comes from MockCourseDataProvider (implementing CourseDataProviderInterface). The mock provider has 5 courses with IDs 1-5. Real course data will come from Team Papa's Course Service. See the team-specific integration requirement documents for details.</w:t>
+      </w:r>
+    </w:p>
+    <w:p>
+      <w:pPr>
+        <w:pStyle w:val="Normal"/>
+      </w:pPr>
+      <w:r>
+        <w:t xml:space="preserve">}</w:t>
+      </w:r>
+    </w:p>
+    <w:p>
+      <w:pPr>
+        <w:pStyle w:val="Normal"/>
+      </w:pPr>
+      <w:r>
+        <w:t xml:space="preserve">  ]</w:t>
+      </w:r>
+    </w:p>
+    <w:p>
+      <w:pPr>
+        <w:pStyle w:val="Normal"/>
+      </w:pPr>
+      <w:r>
+        <w:t xml:space="preserve">    }</w:t>
+      </w:r>
+    </w:p>
+    <w:p>
+      <w:pPr>
+        <w:pStyle w:val="Normal"/>
+      </w:pPr>
+      <w:r>
+        <w:t xml:space="preserve">      ]</w:t>
+      </w:r>
+    </w:p>
+    <w:p>
+      <w:pPr>
+        <w:pStyle w:val="Normal"/>
+      </w:pPr>
+      <w:r>
+        <w:t xml:space="preserve">        { "id": 103, "name": "Business Plan Challenge", "status": "locked" }</w:t>
+      </w:r>
+    </w:p>
+    <w:p>
+      <w:pPr>
+        <w:pStyle w:val="Normal"/>
+      </w:pPr>
+      <w:r>
+        <w:t xml:space="preserve">        { "id": 102, "name": "Business Models", "status": "active" },</w:t>
+      </w:r>
+    </w:p>
+    <w:p>
+      <w:pPr>
+        <w:pStyle w:val="Normal"/>
+      </w:pPr>
+      <w:r>
+        <w:t xml:space="preserve">        { "id": 101, "name": "What is a Business?", "status": "complete" },</w:t>
+      </w:r>
+    </w:p>
+    <w:p>
+      <w:pPr>
+        <w:pStyle w:val="Normal"/>
+      </w:pPr>
+      <w:r>
+        <w:t xml:space="preserve">      "blocks": [</w:t>
+      </w:r>
+    </w:p>
+    <w:p>
+      <w:pPr>
+        <w:pStyle w:val="Normal"/>
+      </w:pPr>
+      <w:r>
+        <w:t xml:space="preserve">      "description": "Learn the basics of starting and running a business.",</w:t>
+      </w:r>
+    </w:p>
+    <w:p>
+      <w:pPr>
+        <w:pStyle w:val="Normal"/>
+      </w:pPr>
+      <w:r>
+        <w:t xml:space="preserve">      "name": "Intro to Entrepreneurship",</w:t>
+      </w:r>
+    </w:p>
+    <w:p>
+      <w:pPr>
+        <w:pStyle w:val="Normal"/>
+      </w:pPr>
+      <w:r>
+        <w:t xml:space="preserve">      "id": 1,</w:t>
+      </w:r>
+    </w:p>
+    <w:p>
+      <w:pPr>
+        <w:pStyle w:val="Normal"/>
+      </w:pPr>
+      <w:r>
+        <w:t xml:space="preserve">    {</w:t>
+      </w:r>
+    </w:p>
+    <w:p>
+      <w:pPr>
+        <w:pStyle w:val="Normal"/>
+      </w:pPr>
+      <w:r>
+        <w:t xml:space="preserve">  "data": [</w:t>
+      </w:r>
+    </w:p>
+    <w:p>
+      <w:pPr>
+        <w:pStyle w:val="Normal"/>
+      </w:pPr>
+      <w:r>
+        <w:t xml:space="preserve">{</w:t>
+      </w:r>
+    </w:p>
+    <w:p>
+      <w:pPr>
+        <w:pStyle w:val="Normal"/>
+      </w:pPr>
+      <w:r>
+        <w:t>Example response (200):</w:t>
+      </w:r>
+    </w:p>
+    <w:p>
+      <w:pPr>
+        <w:pStyle w:val="List Bullet"/>
+      </w:pPr>
+      <w:r>
+        <w:t xml:space="preserve">Authorization: Bearer {token} (required)</w:t>
+      </w:r>
+    </w:p>
+    <w:p>
+      <w:pPr>
+        <w:pStyle w:val="Normal"/>
+      </w:pPr>
+      <w:r>
+        <w:t xml:space="preserve">Headers:</w:t>
+      </w:r>
+    </w:p>
+    <w:p>
+      <w:pPr>
+        <w:pStyle w:val="Normal"/>
+      </w:pPr>
+      <w:r>
+        <w:t xml:space="preserve">Returns the full course catalogue from the (mock) course data provider. Used by frontends to populate course selection dropdowns when creating or editing an Experience. Admin and teacher only (students/parents get 403).</w:t>
+      </w:r>
+    </w:p>
+    <w:p>
+      <w:pPr>
+        <w:pStyle w:val="Normal"/>
+      </w:pPr>
+      <w:r>
+        <w:t xml:space="preserve">GET /api/school/courses</w:t>
+      </w:r>
+    </w:p>
+    <w:p>
+      <w:pPr>
+        <w:pStyle w:val="Heading 3"/>
+      </w:pPr>
+      <w:r>
+        <w:t xml:space="preserve">Course Catalogue</w:t>
+      </w:r>
+    </w:p>
+    <w:p>
+      <w:pPr>
         <w:pStyle w:val="Heading2"/>
       </w:pPr>
       <w:r>
@@ -17607,7 +17810,7 @@
         <w:rPr>
           <w:b/>
         </w:rPr>
-        <w:t>Response (200):</w:t>
+        <w:t>Example response (200):</w:t>
       </w:r>
     </w:p>
     <w:p>
@@ -17663,7 +17866,25 @@
           <w:color w:val="333333"/>
           <w:sz w:val="18"/>
         </w:rPr>
-        <w:t xml:space="preserve">  "timestamp": "2026-03-12T14:30:00+00:00"</w:t>
+        <w:t xml:space="preserve">  "timestamp": "2026-03-12T14:30:00+00:00",</w:t>
+      </w:r>
+    </w:p>
+    <w:p>
+      <w:pPr>
+        <w:shd w:val="clear" w:color="auto" w:fill="F5F5F5"/>
+        <w:spacing w:after="0" w:line="240" w:lineRule="auto"/>
+      </w:pPr>
+      <w:r>
+        <w:t>  "database": "connected",</w:t>
+      </w:r>
+    </w:p>
+    <w:p>
+      <w:pPr>
+        <w:shd w:val="clear" w:color="auto" w:fill="F5F5F5"/>
+        <w:spacing w:after="0" w:line="240" w:lineRule="auto"/>
+      </w:pPr>
+      <w:r>
+        <w:t>  "downstream": { "experience-service": "reachable", "enrolment-service": "reachable" }</w:t>
       </w:r>
     </w:p>
     <w:p>
@@ -17772,8 +17993,7 @@
         <w:rPr>
           <w:b/>
         </w:rPr>
-        <w:lastRenderedPageBreak/>
-        <w:t>Response (200):</w:t>
+        <w:t>Example response (200):</w:t>
       </w:r>
     </w:p>
     <w:p>
@@ -19142,7 +19362,7 @@
         <w:rPr>
           <w:b/>
         </w:rPr>
-        <w:t>Response (200):</w:t>
+        <w:t>Example response (200):</w:t>
       </w:r>
     </w:p>
     <w:p>
@@ -19670,21 +19890,51 @@
           <w:color w:val="333333"/>
           <w:sz w:val="18"/>
         </w:rPr>
-        <w:t xml:space="preserve">  "credentials": [],</w:t>
-      </w:r>
-    </w:p>
-    <w:p>
-      <w:pPr>
-        <w:shd w:val="clear" w:color="auto" w:fill="F5F5F5"/>
-        <w:spacing w:after="0" w:line="240" w:lineRule="auto"/>
-      </w:pPr>
-      <w:r>
-        <w:rPr>
-          <w:rFonts w:ascii="Consolas" w:hAnsi="Consolas"/>
-          <w:color w:val="333333"/>
-          <w:sz w:val="18"/>
-        </w:rPr>
-        <w:t xml:space="preserve">  "</w:t>
+        <w:t xml:space="preserve">  "credentials": [</w:t>
+        <w:br/>
+        <w:t xml:space="preserve">    { "id": 1, "type": "credential", "name": "Entrepreneurial Thinking Foundations", "issuing_course": "Intro to Entrepreneurship", "earned_at": "2026-02-15T00:00:00Z", "status": "earned" },</w:t>
+        <w:br/>
+        <w:t xml:space="preserve">    { "id": 2, "type": "badge", "name": "Entrepreneur's Choice Award", "issuing_course": "Marketing Basics", "earned_at": "2026-02-28T00:00:00Z", "status": "earned" },</w:t>
+        <w:br/>
+        <w:t xml:space="preserve">    { "id": 3, "type": "certificate", "name": "Financial Literacy Completion", "issuing_course": "Financial Literacy", "earned_at": "2026-03-05T00:00:00Z", "status": "earned" }</w:t>
+        <w:br/>
+        <w:t xml:space="preserve">  ],</w:t>
+      </w:r>
+    </w:p>
+    <w:p>
+      <w:pPr>
+        <w:shd w:val="clear" w:color="auto" w:fill="F5F5F5"/>
+        <w:spacing w:after="0" w:line="240" w:lineRule="auto"/>
+      </w:pPr>
+      <w:r>
+        <w:rPr>
+          <w:rFonts w:ascii="Consolas" w:hAnsi="Consolas"/>
+          <w:color w:val="333333"/>
+          <w:sz w:val="18"/>
+        </w:rPr>
+        <w:t xml:space="preserve">  "curriculum_mapping": {</w:t>
+        <w:br/>
+        <w:t xml:space="preserve">    "business_studies": {</w:t>
+        <w:br/>
+        <w:t xml:space="preserve">      "area_name": "Business Studies",</w:t>
+        <w:br/>
+        <w:t xml:space="preserve">      "requirements_met": [</w:t>
+        <w:br/>
+        <w:t xml:space="preserve">        { "code": "BS-1.1", "description": "Identify business opportunities", "met_by": "Intro to Entrepreneurship" }</w:t>
+        <w:br/>
+        <w:t xml:space="preserve">      ],</w:t>
+        <w:br/>
+        <w:t xml:space="preserve">      "total_requirements": 8,</w:t>
+        <w:br/>
+        <w:t xml:space="preserve">      "coverage_percentage": 0.38</w:t>
+        <w:br/>
+        <w:t xml:space="preserve">    },</w:t>
+        <w:br/>
+        <w:t xml:space="preserve">    "ctf_design_studies": { "area_name": "CTF Design Studies", "requirements_met": [...], "total_requirements": 7, "coverage_percentage": 0.29 },</w:t>
+        <w:br/>
+        <w:t xml:space="preserve">    "calm": { "area_name": "Career and Life Management", "requirements_met": [...], "total_requirements": 5, "coverage_percentage": 0.40 }</w:t>
+        <w:br/>
+        <w:t xml:space="preserve">  }</w:t>
       </w:r>
       <w:proofErr w:type="spellStart"/>
       <w:proofErr w:type="gramStart"/>
@@ -19694,7 +19944,6 @@
           <w:color w:val="333333"/>
           <w:sz w:val="18"/>
         </w:rPr>
-        <w:t>curriculum</w:t>
       </w:r>
       <w:proofErr w:type="gramEnd"/>
       <w:r>
@@ -19703,7 +19952,6 @@
           <w:color w:val="333333"/>
           <w:sz w:val="18"/>
         </w:rPr>
-        <w:t>_mapping</w:t>
       </w:r>
       <w:proofErr w:type="spellEnd"/>
       <w:r>
@@ -19712,7 +19960,6 @@
           <w:color w:val="333333"/>
           <w:sz w:val="18"/>
         </w:rPr>
-        <w:t>": []</w:t>
       </w:r>
     </w:p>
     <w:p>
@@ -19734,7 +19981,7 @@
         <w:rPr>
           <w:b/>
         </w:rPr>
-        <w:t>Error (404):</w:t>
+        <w:t>Example error (404):</w:t>
       </w:r>
     </w:p>
     <w:p>
@@ -20119,20 +20366,15 @@
         <w:rPr>
           <w:b/>
         </w:rPr>
-        <w:t>Response (200):</w:t>
-      </w:r>
-    </w:p>
-    <w:p>
-      <w:pPr>
-        <w:shd w:val="clear" w:color="auto" w:fill="F5F5F5"/>
-        <w:spacing w:after="0" w:line="240" w:lineRule="auto"/>
-      </w:pPr>
-      <w:r>
-        <w:rPr>
-          <w:rFonts w:ascii="Consolas" w:hAnsi="Consolas"/>
-          <w:color w:val="333333"/>
-          <w:sz w:val="18"/>
-        </w:rPr>
+        <w:t>Example response (200):</w:t>
+      </w:r>
+    </w:p>
+    <w:p>
+      <w:pPr>
+        <w:shd w:val="clear" w:color="auto" w:fill="F5F5F5"/>
+        <w:spacing w:after="0" w:line="240" w:lineRule="auto"/>
+      </w:pPr>
+      <w:r>
         <w:t>{</w:t>
       </w:r>
     </w:p>
@@ -20142,137 +20384,33 @@
         <w:spacing w:after="0" w:line="240" w:lineRule="auto"/>
       </w:pPr>
       <w:r>
-        <w:rPr>
-          <w:rFonts w:ascii="Consolas" w:hAnsi="Consolas"/>
-          <w:color w:val="333333"/>
-          <w:sz w:val="18"/>
-        </w:rPr>
-        <w:t xml:space="preserve">  "</w:t>
-      </w:r>
-      <w:proofErr w:type="spellStart"/>
-      <w:proofErr w:type="gramStart"/>
-      <w:r>
-        <w:rPr>
-          <w:rFonts w:ascii="Consolas" w:hAnsi="Consolas"/>
-          <w:color w:val="333333"/>
-          <w:sz w:val="18"/>
-        </w:rPr>
-        <w:t>school</w:t>
-      </w:r>
-      <w:proofErr w:type="gramEnd"/>
-      <w:r>
-        <w:rPr>
-          <w:rFonts w:ascii="Consolas" w:hAnsi="Consolas"/>
-          <w:color w:val="333333"/>
-          <w:sz w:val="18"/>
-        </w:rPr>
-        <w:t>_id</w:t>
-      </w:r>
-      <w:proofErr w:type="spellEnd"/>
-      <w:r>
-        <w:rPr>
-          <w:rFonts w:ascii="Consolas" w:hAnsi="Consolas"/>
-          <w:color w:val="333333"/>
-          <w:sz w:val="18"/>
-        </w:rPr>
-        <w:t>": 1,</w:t>
-      </w:r>
-    </w:p>
-    <w:p>
-      <w:pPr>
-        <w:shd w:val="clear" w:color="auto" w:fill="F5F5F5"/>
-        <w:spacing w:after="0" w:line="240" w:lineRule="auto"/>
-      </w:pPr>
-      <w:r>
-        <w:rPr>
-          <w:rFonts w:ascii="Consolas" w:hAnsi="Consolas"/>
-          <w:color w:val="333333"/>
-          <w:sz w:val="18"/>
-        </w:rPr>
-        <w:t xml:space="preserve">  "</w:t>
-      </w:r>
-      <w:proofErr w:type="spellStart"/>
-      <w:proofErr w:type="gramStart"/>
-      <w:r>
-        <w:rPr>
-          <w:rFonts w:ascii="Consolas" w:hAnsi="Consolas"/>
-          <w:color w:val="333333"/>
-          <w:sz w:val="18"/>
-        </w:rPr>
-        <w:t>pos</w:t>
-      </w:r>
-      <w:proofErr w:type="gramEnd"/>
-      <w:r>
-        <w:rPr>
-          <w:rFonts w:ascii="Consolas" w:hAnsi="Consolas"/>
-          <w:color w:val="333333"/>
-          <w:sz w:val="18"/>
-        </w:rPr>
-        <w:t>_areas</w:t>
-      </w:r>
-      <w:proofErr w:type="spellEnd"/>
-      <w:r>
-        <w:rPr>
-          <w:rFonts w:ascii="Consolas" w:hAnsi="Consolas"/>
-          <w:color w:val="333333"/>
-          <w:sz w:val="18"/>
-        </w:rPr>
-        <w:t>": ["Business Studies", "CTF Design Studies", "CALM"],</w:t>
-      </w:r>
-    </w:p>
-    <w:p>
-      <w:pPr>
-        <w:shd w:val="clear" w:color="auto" w:fill="F5F5F5"/>
-        <w:spacing w:after="0" w:line="240" w:lineRule="auto"/>
-      </w:pPr>
-      <w:r>
-        <w:rPr>
-          <w:rFonts w:ascii="Consolas" w:hAnsi="Consolas"/>
-          <w:color w:val="333333"/>
-          <w:sz w:val="18"/>
-        </w:rPr>
-        <w:t xml:space="preserve">  "</w:t>
-      </w:r>
-      <w:proofErr w:type="spellStart"/>
-      <w:proofErr w:type="gramStart"/>
-      <w:r>
-        <w:rPr>
-          <w:rFonts w:ascii="Consolas" w:hAnsi="Consolas"/>
-          <w:color w:val="333333"/>
-          <w:sz w:val="18"/>
-        </w:rPr>
-        <w:t>student</w:t>
-      </w:r>
-      <w:proofErr w:type="gramEnd"/>
-      <w:r>
-        <w:rPr>
-          <w:rFonts w:ascii="Consolas" w:hAnsi="Consolas"/>
-          <w:color w:val="333333"/>
-          <w:sz w:val="18"/>
-        </w:rPr>
-        <w:t>_coverage</w:t>
-      </w:r>
-      <w:proofErr w:type="spellEnd"/>
-      <w:r>
-        <w:rPr>
-          <w:rFonts w:ascii="Consolas" w:hAnsi="Consolas"/>
-          <w:color w:val="333333"/>
-          <w:sz w:val="18"/>
-        </w:rPr>
-        <w:t>": [</w:t>
-      </w:r>
-    </w:p>
-    <w:p>
-      <w:pPr>
-        <w:shd w:val="clear" w:color="auto" w:fill="F5F5F5"/>
-        <w:spacing w:after="0" w:line="240" w:lineRule="auto"/>
-      </w:pPr>
-      <w:r>
-        <w:rPr>
-          <w:rFonts w:ascii="Consolas" w:hAnsi="Consolas"/>
-          <w:color w:val="333333"/>
-          <w:sz w:val="18"/>
-        </w:rPr>
+        <w:t xml:space="preserve">  "school_id": 1,</w:t>
+      </w:r>
+    </w:p>
+    <w:p>
+      <w:pPr>
+        <w:shd w:val="clear" w:color="auto" w:fill="F5F5F5"/>
+        <w:spacing w:after="0" w:line="240" w:lineRule="auto"/>
+      </w:pPr>
+      <w:r>
+        <w:t xml:space="preserve">  "pos_areas": ["Business Studies", "CTF Design Studies", "CALM"],</w:t>
+      </w:r>
+    </w:p>
+    <w:p>
+      <w:pPr>
+        <w:shd w:val="clear" w:color="auto" w:fill="F5F5F5"/>
+        <w:spacing w:after="0" w:line="240" w:lineRule="auto"/>
+      </w:pPr>
+      <w:r>
+        <w:t xml:space="preserve">  "student_coverage": [</w:t>
+      </w:r>
+    </w:p>
+    <w:p>
+      <w:pPr>
+        <w:shd w:val="clear" w:color="auto" w:fill="F5F5F5"/>
+        <w:spacing w:after="0" w:line="240" w:lineRule="auto"/>
+      </w:pPr>
+      <w:r>
         <w:t xml:space="preserve">    {</w:t>
       </w:r>
     </w:p>
@@ -20282,275 +20420,249 @@
         <w:spacing w:after="0" w:line="240" w:lineRule="auto"/>
       </w:pPr>
       <w:r>
-        <w:rPr>
-          <w:rFonts w:ascii="Consolas" w:hAnsi="Consolas"/>
-          <w:color w:val="333333"/>
-          <w:sz w:val="18"/>
-        </w:rPr>
-        <w:t xml:space="preserve">      "</w:t>
-      </w:r>
-      <w:proofErr w:type="spellStart"/>
-      <w:proofErr w:type="gramStart"/>
-      <w:r>
-        <w:rPr>
-          <w:rFonts w:ascii="Consolas" w:hAnsi="Consolas"/>
-          <w:color w:val="333333"/>
-          <w:sz w:val="18"/>
-        </w:rPr>
-        <w:t>student</w:t>
-      </w:r>
-      <w:proofErr w:type="gramEnd"/>
-      <w:r>
-        <w:rPr>
-          <w:rFonts w:ascii="Consolas" w:hAnsi="Consolas"/>
-          <w:color w:val="333333"/>
-          <w:sz w:val="18"/>
-        </w:rPr>
-        <w:t>_id</w:t>
-      </w:r>
-      <w:proofErr w:type="spellEnd"/>
-      <w:r>
-        <w:rPr>
-          <w:rFonts w:ascii="Consolas" w:hAnsi="Consolas"/>
-          <w:color w:val="333333"/>
-          <w:sz w:val="18"/>
-        </w:rPr>
-        <w:t>": 3,</w:t>
-      </w:r>
-    </w:p>
-    <w:p>
-      <w:pPr>
-        <w:shd w:val="clear" w:color="auto" w:fill="F5F5F5"/>
-        <w:spacing w:after="0" w:line="240" w:lineRule="auto"/>
-      </w:pPr>
-      <w:r>
-        <w:rPr>
-          <w:rFonts w:ascii="Consolas" w:hAnsi="Consolas"/>
-          <w:color w:val="333333"/>
-          <w:sz w:val="18"/>
-        </w:rPr>
-        <w:t xml:space="preserve">      "name": "Alice Student",</w:t>
-      </w:r>
-    </w:p>
-    <w:p>
-      <w:pPr>
-        <w:shd w:val="clear" w:color="auto" w:fill="F5F5F5"/>
-        <w:spacing w:after="0" w:line="240" w:lineRule="auto"/>
-      </w:pPr>
-      <w:r>
-        <w:rPr>
-          <w:rFonts w:ascii="Consolas" w:hAnsi="Consolas"/>
-          <w:color w:val="333333"/>
-          <w:sz w:val="18"/>
-        </w:rPr>
-        <w:t xml:space="preserve">      "coverage</w:t>
-      </w:r>
-      <w:proofErr w:type="gramStart"/>
-      <w:r>
-        <w:rPr>
-          <w:rFonts w:ascii="Consolas" w:hAnsi="Consolas"/>
-          <w:color w:val="333333"/>
-          <w:sz w:val="18"/>
-        </w:rPr>
-        <w:t>": {</w:t>
-      </w:r>
-      <w:proofErr w:type="gramEnd"/>
-    </w:p>
-    <w:p>
-      <w:pPr>
-        <w:shd w:val="clear" w:color="auto" w:fill="F5F5F5"/>
-        <w:spacing w:after="0" w:line="240" w:lineRule="auto"/>
-      </w:pPr>
-      <w:r>
-        <w:rPr>
-          <w:rFonts w:ascii="Consolas" w:hAnsi="Consolas"/>
-          <w:color w:val="333333"/>
-          <w:sz w:val="18"/>
-        </w:rPr>
-        <w:t xml:space="preserve">        "Business Studies": 0.0,</w:t>
-      </w:r>
-    </w:p>
-    <w:p>
-      <w:pPr>
-        <w:shd w:val="clear" w:color="auto" w:fill="F5F5F5"/>
-        <w:spacing w:after="0" w:line="240" w:lineRule="auto"/>
-      </w:pPr>
-      <w:r>
-        <w:rPr>
-          <w:rFonts w:ascii="Consolas" w:hAnsi="Consolas"/>
-          <w:color w:val="333333"/>
-          <w:sz w:val="18"/>
-        </w:rPr>
-        <w:t xml:space="preserve">        "CTF Design Studies": 0.0,</w:t>
-      </w:r>
-    </w:p>
-    <w:p>
-      <w:pPr>
-        <w:shd w:val="clear" w:color="auto" w:fill="F5F5F5"/>
-        <w:spacing w:after="0" w:line="240" w:lineRule="auto"/>
-      </w:pPr>
-      <w:r>
-        <w:rPr>
-          <w:rFonts w:ascii="Consolas" w:hAnsi="Consolas"/>
-          <w:color w:val="333333"/>
-          <w:sz w:val="18"/>
-        </w:rPr>
-        <w:t xml:space="preserve">        "CALM": 0.0</w:t>
-      </w:r>
-    </w:p>
-    <w:p>
-      <w:pPr>
-        <w:shd w:val="clear" w:color="auto" w:fill="F5F5F5"/>
-        <w:spacing w:after="0" w:line="240" w:lineRule="auto"/>
-      </w:pPr>
-      <w:r>
-        <w:rPr>
-          <w:rFonts w:ascii="Consolas" w:hAnsi="Consolas"/>
-          <w:color w:val="333333"/>
-          <w:sz w:val="18"/>
-        </w:rPr>
-        <w:t xml:space="preserve">      }</w:t>
-      </w:r>
-    </w:p>
-    <w:p>
-      <w:pPr>
-        <w:shd w:val="clear" w:color="auto" w:fill="F5F5F5"/>
-        <w:spacing w:after="0" w:line="240" w:lineRule="auto"/>
-      </w:pPr>
-      <w:r>
-        <w:rPr>
-          <w:rFonts w:ascii="Consolas" w:hAnsi="Consolas"/>
-          <w:color w:val="333333"/>
-          <w:sz w:val="18"/>
-        </w:rPr>
-        <w:t xml:space="preserve">    }</w:t>
-      </w:r>
-    </w:p>
-    <w:p>
-      <w:pPr>
-        <w:shd w:val="clear" w:color="auto" w:fill="F5F5F5"/>
-        <w:spacing w:after="0" w:line="240" w:lineRule="auto"/>
-      </w:pPr>
-      <w:r>
-        <w:rPr>
-          <w:rFonts w:ascii="Consolas" w:hAnsi="Consolas"/>
-          <w:color w:val="333333"/>
-          <w:sz w:val="18"/>
-        </w:rPr>
-        <w:t xml:space="preserve">  ],</w:t>
-      </w:r>
-    </w:p>
-    <w:p>
-      <w:pPr>
-        <w:shd w:val="clear" w:color="auto" w:fill="F5F5F5"/>
-        <w:spacing w:after="0" w:line="240" w:lineRule="auto"/>
-      </w:pPr>
-      <w:r>
-        <w:rPr>
-          <w:rFonts w:ascii="Consolas" w:hAnsi="Consolas"/>
-          <w:color w:val="333333"/>
-          <w:sz w:val="18"/>
-        </w:rPr>
-        <w:t xml:space="preserve">  "</w:t>
-      </w:r>
-      <w:proofErr w:type="spellStart"/>
-      <w:proofErr w:type="gramStart"/>
-      <w:r>
-        <w:rPr>
-          <w:rFonts w:ascii="Consolas" w:hAnsi="Consolas"/>
-          <w:color w:val="333333"/>
-          <w:sz w:val="18"/>
-        </w:rPr>
-        <w:t>school</w:t>
-      </w:r>
-      <w:proofErr w:type="gramEnd"/>
-      <w:r>
-        <w:rPr>
-          <w:rFonts w:ascii="Consolas" w:hAnsi="Consolas"/>
-          <w:color w:val="333333"/>
-          <w:sz w:val="18"/>
-        </w:rPr>
-        <w:t>_averages</w:t>
-      </w:r>
-      <w:proofErr w:type="spellEnd"/>
-      <w:proofErr w:type="gramStart"/>
-      <w:r>
-        <w:rPr>
-          <w:rFonts w:ascii="Consolas" w:hAnsi="Consolas"/>
-          <w:color w:val="333333"/>
-          <w:sz w:val="18"/>
-        </w:rPr>
-        <w:t>": {</w:t>
-      </w:r>
-      <w:proofErr w:type="gramEnd"/>
-    </w:p>
-    <w:p>
-      <w:pPr>
-        <w:shd w:val="clear" w:color="auto" w:fill="F5F5F5"/>
-        <w:spacing w:after="0" w:line="240" w:lineRule="auto"/>
-      </w:pPr>
-      <w:r>
-        <w:rPr>
-          <w:rFonts w:ascii="Consolas" w:hAnsi="Consolas"/>
-          <w:color w:val="333333"/>
-          <w:sz w:val="18"/>
-        </w:rPr>
-        <w:t xml:space="preserve">    "Business Studies": 0.0,</w:t>
-      </w:r>
-    </w:p>
-    <w:p>
-      <w:pPr>
-        <w:shd w:val="clear" w:color="auto" w:fill="F5F5F5"/>
-        <w:spacing w:after="0" w:line="240" w:lineRule="auto"/>
-      </w:pPr>
-      <w:r>
-        <w:rPr>
-          <w:rFonts w:ascii="Consolas" w:hAnsi="Consolas"/>
-          <w:color w:val="333333"/>
-          <w:sz w:val="18"/>
-        </w:rPr>
-        <w:t xml:space="preserve">    "CTF Design Studies": 0.0,</w:t>
-      </w:r>
-    </w:p>
-    <w:p>
-      <w:pPr>
-        <w:shd w:val="clear" w:color="auto" w:fill="F5F5F5"/>
-        <w:spacing w:after="0" w:line="240" w:lineRule="auto"/>
-      </w:pPr>
-      <w:r>
-        <w:rPr>
-          <w:rFonts w:ascii="Consolas" w:hAnsi="Consolas"/>
-          <w:color w:val="333333"/>
-          <w:sz w:val="18"/>
-        </w:rPr>
-        <w:t xml:space="preserve">    "CALM": 0.0</w:t>
-      </w:r>
-    </w:p>
-    <w:p>
-      <w:pPr>
-        <w:shd w:val="clear" w:color="auto" w:fill="F5F5F5"/>
-        <w:spacing w:after="0" w:line="240" w:lineRule="auto"/>
-      </w:pPr>
-      <w:r>
-        <w:rPr>
-          <w:rFonts w:ascii="Consolas" w:hAnsi="Consolas"/>
-          <w:color w:val="333333"/>
-          <w:sz w:val="18"/>
-        </w:rPr>
-        <w:t xml:space="preserve">  }</w:t>
-      </w:r>
-    </w:p>
-    <w:p>
-      <w:pPr>
-        <w:shd w:val="clear" w:color="auto" w:fill="F5F5F5"/>
-        <w:spacing w:after="0" w:line="240" w:lineRule="auto"/>
-      </w:pPr>
-      <w:r>
-        <w:rPr>
-          <w:rFonts w:ascii="Consolas" w:hAnsi="Consolas"/>
-          <w:color w:val="333333"/>
-          <w:sz w:val="18"/>
-        </w:rPr>
+        <w:t xml:space="preserve">      "student_id": 4,</w:t>
+      </w:r>
+    </w:p>
+    <w:p>
+      <w:pPr>
+        <w:shd w:val="clear" w:color="auto" w:fill="F5F5F5"/>
+        <w:spacing w:after="0" w:line="240" w:lineRule="auto"/>
+      </w:pPr>
+      <w:r>
+        <w:t xml:space="preserve">      "student_name": "Student 1",</w:t>
+      </w:r>
+    </w:p>
+    <w:p>
+      <w:pPr>
+        <w:shd w:val="clear" w:color="auto" w:fill="F5F5F5"/>
+        <w:spacing w:after="0" w:line="240" w:lineRule="auto"/>
+      </w:pPr>
+      <w:r>
+        <w:t xml:space="preserve">      "coverage": {</w:t>
+      </w:r>
+    </w:p>
+    <w:p>
+      <w:pPr>
+        <w:shd w:val="clear" w:color="auto" w:fill="F5F5F5"/>
+        <w:spacing w:after="0" w:line="240" w:lineRule="auto"/>
+      </w:pPr>
+      <w:r>
+        <w:t xml:space="preserve">        "business_studies": {</w:t>
+      </w:r>
+    </w:p>
+    <w:p>
+      <w:pPr>
+        <w:shd w:val="clear" w:color="auto" w:fill="F5F5F5"/>
+        <w:spacing w:after="0" w:line="240" w:lineRule="auto"/>
+      </w:pPr>
+      <w:r>
+        <w:t xml:space="preserve">          "completed": 3,</w:t>
+      </w:r>
+    </w:p>
+    <w:p>
+      <w:pPr>
+        <w:shd w:val="clear" w:color="auto" w:fill="F5F5F5"/>
+        <w:spacing w:after="0" w:line="240" w:lineRule="auto"/>
+      </w:pPr>
+      <w:r>
+        <w:t xml:space="preserve">          "total": 8,</w:t>
+      </w:r>
+    </w:p>
+    <w:p>
+      <w:pPr>
+        <w:shd w:val="clear" w:color="auto" w:fill="F5F5F5"/>
+        <w:spacing w:after="0" w:line="240" w:lineRule="auto"/>
+      </w:pPr>
+      <w:r>
+        <w:t xml:space="preserve">          "percentage": 0.38</w:t>
+      </w:r>
+    </w:p>
+    <w:p>
+      <w:pPr>
+        <w:shd w:val="clear" w:color="auto" w:fill="F5F5F5"/>
+        <w:spacing w:after="0" w:line="240" w:lineRule="auto"/>
+      </w:pPr>
+      <w:r>
+        <w:t xml:space="preserve">        },</w:t>
+      </w:r>
+    </w:p>
+    <w:p>
+      <w:pPr>
+        <w:shd w:val="clear" w:color="auto" w:fill="F5F5F5"/>
+        <w:spacing w:after="0" w:line="240" w:lineRule="auto"/>
+      </w:pPr>
+      <w:r>
+        <w:t xml:space="preserve">        "ctf_design_studies": {</w:t>
+      </w:r>
+    </w:p>
+    <w:p>
+      <w:pPr>
+        <w:shd w:val="clear" w:color="auto" w:fill="F5F5F5"/>
+        <w:spacing w:after="0" w:line="240" w:lineRule="auto"/>
+      </w:pPr>
+      <w:r>
+        <w:t xml:space="preserve">          "completed": 2,</w:t>
+      </w:r>
+    </w:p>
+    <w:p>
+      <w:pPr>
+        <w:shd w:val="clear" w:color="auto" w:fill="F5F5F5"/>
+        <w:spacing w:after="0" w:line="240" w:lineRule="auto"/>
+      </w:pPr>
+      <w:r>
+        <w:t xml:space="preserve">          "total": 7,</w:t>
+      </w:r>
+    </w:p>
+    <w:p>
+      <w:pPr>
+        <w:shd w:val="clear" w:color="auto" w:fill="F5F5F5"/>
+        <w:spacing w:after="0" w:line="240" w:lineRule="auto"/>
+      </w:pPr>
+      <w:r>
+        <w:t xml:space="preserve">          "percentage": 0.29</w:t>
+      </w:r>
+    </w:p>
+    <w:p>
+      <w:pPr>
+        <w:shd w:val="clear" w:color="auto" w:fill="F5F5F5"/>
+        <w:spacing w:after="0" w:line="240" w:lineRule="auto"/>
+      </w:pPr>
+      <w:r>
+        <w:t xml:space="preserve">        },</w:t>
+      </w:r>
+    </w:p>
+    <w:p>
+      <w:pPr>
+        <w:shd w:val="clear" w:color="auto" w:fill="F5F5F5"/>
+        <w:spacing w:after="0" w:line="240" w:lineRule="auto"/>
+      </w:pPr>
+      <w:r>
+        <w:t xml:space="preserve">        "calm": {</w:t>
+      </w:r>
+    </w:p>
+    <w:p>
+      <w:pPr>
+        <w:shd w:val="clear" w:color="auto" w:fill="F5F5F5"/>
+        <w:spacing w:after="0" w:line="240" w:lineRule="auto"/>
+      </w:pPr>
+      <w:r>
+        <w:t xml:space="preserve">          "completed": 2,</w:t>
+      </w:r>
+    </w:p>
+    <w:p>
+      <w:pPr>
+        <w:shd w:val="clear" w:color="auto" w:fill="F5F5F5"/>
+        <w:spacing w:after="0" w:line="240" w:lineRule="auto"/>
+      </w:pPr>
+      <w:r>
+        <w:t>          "total": 5,</w:t>
+      </w:r>
+    </w:p>
+    <w:p>
+      <w:pPr>
+        <w:shd w:val="clear" w:color="auto" w:fill="F5F5F5"/>
+        <w:spacing w:after="0" w:line="240" w:lineRule="auto"/>
+      </w:pPr>
+      <w:r>
+        <w:t>          "percentage": 0.40</w:t>
+      </w:r>
+    </w:p>
+    <w:p>
+      <w:pPr>
+        <w:shd w:val="clear" w:color="auto" w:fill="F5F5F5"/>
+        <w:spacing w:after="0" w:line="240" w:lineRule="auto"/>
+      </w:pPr>
+      <w:r>
+        <w:t>        }</w:t>
+      </w:r>
+    </w:p>
+    <w:p>
+      <w:pPr>
+        <w:shd w:val="clear" w:color="auto" w:fill="F5F5F5"/>
+        <w:spacing w:after="0" w:line="240" w:lineRule="auto"/>
+      </w:pPr>
+      <w:r>
+        <w:t>      },</w:t>
+      </w:r>
+    </w:p>
+    <w:p>
+      <w:pPr>
+        <w:shd w:val="clear" w:color="auto" w:fill="F5F5F5"/>
+        <w:spacing w:after="0" w:line="240" w:lineRule="auto"/>
+      </w:pPr>
+      <w:r>
+        <w:t>      "overall_coverage": 0.35</w:t>
+      </w:r>
+    </w:p>
+    <w:p>
+      <w:pPr>
+        <w:shd w:val="clear" w:color="auto" w:fill="F5F5F5"/>
+        <w:spacing w:after="0" w:line="240" w:lineRule="auto"/>
+      </w:pPr>
+      <w:r>
+        <w:t>    }</w:t>
+      </w:r>
+    </w:p>
+    <w:p>
+      <w:pPr>
+        <w:shd w:val="clear" w:color="auto" w:fill="F5F5F5"/>
+        <w:spacing w:after="0" w:line="240" w:lineRule="auto"/>
+      </w:pPr>
+      <w:r>
+        <w:t>  ],</w:t>
+      </w:r>
+    </w:p>
+    <w:p>
+      <w:pPr>
+        <w:shd w:val="clear" w:color="auto" w:fill="F5F5F5"/>
+        <w:spacing w:after="0" w:line="240" w:lineRule="auto"/>
+      </w:pPr>
+      <w:r>
+        <w:t>  "school_averages": {</w:t>
+      </w:r>
+    </w:p>
+    <w:p>
+      <w:pPr>
+        <w:shd w:val="clear" w:color="auto" w:fill="F5F5F5"/>
+        <w:spacing w:after="0" w:line="240" w:lineRule="auto"/>
+      </w:pPr>
+      <w:r>
+        <w:t>    "business_studies": 0.45,</w:t>
+      </w:r>
+    </w:p>
+    <w:p>
+      <w:pPr>
+        <w:shd w:val="clear" w:color="auto" w:fill="F5F5F5"/>
+        <w:spacing w:after="0" w:line="240" w:lineRule="auto"/>
+      </w:pPr>
+      <w:r>
+        <w:t>    "ctf_design_studies": 0.38,</w:t>
+      </w:r>
+    </w:p>
+    <w:p>
+      <w:pPr>
+        <w:shd w:val="clear" w:color="auto" w:fill="F5F5F5"/>
+        <w:spacing w:after="0" w:line="240" w:lineRule="auto"/>
+      </w:pPr>
+      <w:r>
+        <w:t>    "calm": 0.52</w:t>
+      </w:r>
+    </w:p>
+    <w:p>
+      <w:pPr>
+        <w:shd w:val="clear" w:color="auto" w:fill="F5F5F5"/>
+        <w:spacing w:after="0" w:line="240" w:lineRule="auto"/>
+      </w:pPr>
+      <w:r>
+        <w:t>  }</w:t>
+      </w:r>
+    </w:p>
+    <w:p>
+      <w:pPr>
+        <w:shd w:val="clear" w:color="auto" w:fill="F5F5F5"/>
+        <w:spacing w:after="0" w:line="240" w:lineRule="auto"/>
+      </w:pPr>
+      <w:r>
         <w:t>}</w:t>
       </w:r>
     </w:p>
@@ -20694,20 +20806,15 @@
         <w:rPr>
           <w:b/>
         </w:rPr>
-        <w:t>Response (200):</w:t>
-      </w:r>
-    </w:p>
-    <w:p>
-      <w:pPr>
-        <w:shd w:val="clear" w:color="auto" w:fill="F5F5F5"/>
-        <w:spacing w:after="0" w:line="240" w:lineRule="auto"/>
-      </w:pPr>
-      <w:r>
-        <w:rPr>
-          <w:rFonts w:ascii="Consolas" w:hAnsi="Consolas"/>
-          <w:color w:val="333333"/>
-          <w:sz w:val="18"/>
-        </w:rPr>
+        <w:t>Example response (200):</w:t>
+      </w:r>
+    </w:p>
+    <w:p>
+      <w:pPr>
+        <w:shd w:val="clear" w:color="auto" w:fill="F5F5F5"/>
+        <w:spacing w:after="0" w:line="240" w:lineRule="auto"/>
+      </w:pPr>
+      <w:r>
         <w:t>{</w:t>
       </w:r>
     </w:p>
@@ -20717,53 +20824,15 @@
         <w:spacing w:after="0" w:line="240" w:lineRule="auto"/>
       </w:pPr>
       <w:r>
-        <w:rPr>
-          <w:rFonts w:ascii="Consolas" w:hAnsi="Consolas"/>
-          <w:color w:val="333333"/>
-          <w:sz w:val="18"/>
-        </w:rPr>
-        <w:t xml:space="preserve">  "</w:t>
-      </w:r>
-      <w:proofErr w:type="spellStart"/>
-      <w:proofErr w:type="gramStart"/>
-      <w:r>
-        <w:rPr>
-          <w:rFonts w:ascii="Consolas" w:hAnsi="Consolas"/>
-          <w:color w:val="333333"/>
-          <w:sz w:val="18"/>
-        </w:rPr>
-        <w:t>school</w:t>
-      </w:r>
-      <w:proofErr w:type="gramEnd"/>
-      <w:r>
-        <w:rPr>
-          <w:rFonts w:ascii="Consolas" w:hAnsi="Consolas"/>
-          <w:color w:val="333333"/>
-          <w:sz w:val="18"/>
-        </w:rPr>
-        <w:t>_id</w:t>
-      </w:r>
-      <w:proofErr w:type="spellEnd"/>
-      <w:r>
-        <w:rPr>
-          <w:rFonts w:ascii="Consolas" w:hAnsi="Consolas"/>
-          <w:color w:val="333333"/>
-          <w:sz w:val="18"/>
-        </w:rPr>
-        <w:t>": 1,</w:t>
-      </w:r>
-    </w:p>
-    <w:p>
-      <w:pPr>
-        <w:shd w:val="clear" w:color="auto" w:fill="F5F5F5"/>
-        <w:spacing w:after="0" w:line="240" w:lineRule="auto"/>
-      </w:pPr>
-      <w:r>
-        <w:rPr>
-          <w:rFonts w:ascii="Consolas" w:hAnsi="Consolas"/>
-          <w:color w:val="333333"/>
-          <w:sz w:val="18"/>
-        </w:rPr>
+        <w:t xml:space="preserve">  "school_id": 1,</w:t>
+      </w:r>
+    </w:p>
+    <w:p>
+      <w:pPr>
+        <w:shd w:val="clear" w:color="auto" w:fill="F5F5F5"/>
+        <w:spacing w:after="0" w:line="240" w:lineRule="auto"/>
+      </w:pPr>
+      <w:r>
         <w:t xml:space="preserve">  "period": "last_30_days",</w:t>
       </w:r>
     </w:p>
@@ -20773,181 +20842,42 @@
         <w:spacing w:after="0" w:line="240" w:lineRule="auto"/>
       </w:pPr>
       <w:r>
-        <w:rPr>
-          <w:rFonts w:ascii="Consolas" w:hAnsi="Consolas"/>
-          <w:color w:val="333333"/>
-          <w:sz w:val="18"/>
-        </w:rPr>
-        <w:t xml:space="preserve">  "</w:t>
-      </w:r>
-      <w:proofErr w:type="spellStart"/>
-      <w:proofErr w:type="gramStart"/>
-      <w:r>
-        <w:rPr>
-          <w:rFonts w:ascii="Consolas" w:hAnsi="Consolas"/>
-          <w:color w:val="333333"/>
-          <w:sz w:val="18"/>
-        </w:rPr>
-        <w:t>school</w:t>
-      </w:r>
-      <w:proofErr w:type="gramEnd"/>
-      <w:r>
-        <w:rPr>
-          <w:rFonts w:ascii="Consolas" w:hAnsi="Consolas"/>
-          <w:color w:val="333333"/>
-          <w:sz w:val="18"/>
-        </w:rPr>
-        <w:t>_averages</w:t>
-      </w:r>
-      <w:proofErr w:type="spellEnd"/>
-      <w:proofErr w:type="gramStart"/>
-      <w:r>
-        <w:rPr>
-          <w:rFonts w:ascii="Consolas" w:hAnsi="Consolas"/>
-          <w:color w:val="333333"/>
-          <w:sz w:val="18"/>
-        </w:rPr>
-        <w:t>": {</w:t>
-      </w:r>
-      <w:proofErr w:type="gramEnd"/>
-    </w:p>
-    <w:p>
-      <w:pPr>
-        <w:shd w:val="clear" w:color="auto" w:fill="F5F5F5"/>
-        <w:spacing w:after="0" w:line="240" w:lineRule="auto"/>
-      </w:pPr>
-      <w:r>
-        <w:rPr>
-          <w:rFonts w:ascii="Consolas" w:hAnsi="Consolas"/>
-          <w:color w:val="333333"/>
-          <w:sz w:val="18"/>
-        </w:rPr>
-        <w:t xml:space="preserve">    "</w:t>
-      </w:r>
-      <w:proofErr w:type="spellStart"/>
-      <w:proofErr w:type="gramStart"/>
-      <w:r>
-        <w:rPr>
-          <w:rFonts w:ascii="Consolas" w:hAnsi="Consolas"/>
-          <w:color w:val="333333"/>
-          <w:sz w:val="18"/>
-        </w:rPr>
-        <w:t>login</w:t>
-      </w:r>
-      <w:proofErr w:type="gramEnd"/>
-      <w:r>
-        <w:rPr>
-          <w:rFonts w:ascii="Consolas" w:hAnsi="Consolas"/>
-          <w:color w:val="333333"/>
-          <w:sz w:val="18"/>
-        </w:rPr>
-        <w:t>_frequency</w:t>
-      </w:r>
-      <w:proofErr w:type="spellEnd"/>
-      <w:r>
-        <w:rPr>
-          <w:rFonts w:ascii="Consolas" w:hAnsi="Consolas"/>
-          <w:color w:val="333333"/>
-          <w:sz w:val="18"/>
-        </w:rPr>
-        <w:t>": 0.0,</w:t>
-      </w:r>
-    </w:p>
-    <w:p>
-      <w:pPr>
-        <w:shd w:val="clear" w:color="auto" w:fill="F5F5F5"/>
-        <w:spacing w:after="0" w:line="240" w:lineRule="auto"/>
-      </w:pPr>
-      <w:r>
-        <w:rPr>
-          <w:rFonts w:ascii="Consolas" w:hAnsi="Consolas"/>
-          <w:color w:val="333333"/>
-          <w:sz w:val="18"/>
-        </w:rPr>
-        <w:t xml:space="preserve">    "</w:t>
-      </w:r>
-      <w:proofErr w:type="spellStart"/>
-      <w:proofErr w:type="gramStart"/>
-      <w:r>
-        <w:rPr>
-          <w:rFonts w:ascii="Consolas" w:hAnsi="Consolas"/>
-          <w:color w:val="333333"/>
-          <w:sz w:val="18"/>
-        </w:rPr>
-        <w:t>content</w:t>
-      </w:r>
-      <w:proofErr w:type="gramEnd"/>
-      <w:r>
-        <w:rPr>
-          <w:rFonts w:ascii="Consolas" w:hAnsi="Consolas"/>
-          <w:color w:val="333333"/>
-          <w:sz w:val="18"/>
-        </w:rPr>
-        <w:t>_interaction</w:t>
-      </w:r>
-      <w:proofErr w:type="spellEnd"/>
-      <w:r>
-        <w:rPr>
-          <w:rFonts w:ascii="Consolas" w:hAnsi="Consolas"/>
-          <w:color w:val="333333"/>
-          <w:sz w:val="18"/>
-        </w:rPr>
-        <w:t>": 0.0,</w:t>
-      </w:r>
-    </w:p>
-    <w:p>
-      <w:pPr>
-        <w:shd w:val="clear" w:color="auto" w:fill="F5F5F5"/>
-        <w:spacing w:after="0" w:line="240" w:lineRule="auto"/>
-      </w:pPr>
-      <w:r>
-        <w:rPr>
-          <w:rFonts w:ascii="Consolas" w:hAnsi="Consolas"/>
-          <w:color w:val="333333"/>
-          <w:sz w:val="18"/>
-        </w:rPr>
-        <w:t xml:space="preserve">    "</w:t>
-      </w:r>
-      <w:proofErr w:type="spellStart"/>
-      <w:proofErr w:type="gramStart"/>
-      <w:r>
-        <w:rPr>
-          <w:rFonts w:ascii="Consolas" w:hAnsi="Consolas"/>
-          <w:color w:val="333333"/>
-          <w:sz w:val="18"/>
-        </w:rPr>
-        <w:t>assignment</w:t>
-      </w:r>
-      <w:proofErr w:type="gramEnd"/>
-      <w:r>
-        <w:rPr>
-          <w:rFonts w:ascii="Consolas" w:hAnsi="Consolas"/>
-          <w:color w:val="333333"/>
-          <w:sz w:val="18"/>
-        </w:rPr>
-        <w:t>_completion</w:t>
-      </w:r>
-      <w:proofErr w:type="spellEnd"/>
-      <w:r>
-        <w:rPr>
-          <w:rFonts w:ascii="Consolas" w:hAnsi="Consolas"/>
-          <w:color w:val="333333"/>
-          <w:sz w:val="18"/>
-        </w:rPr>
-        <w:t>": 0.0</w:t>
-      </w:r>
-    </w:p>
-    <w:p>
-      <w:pPr>
-        <w:shd w:val="clear" w:color="auto" w:fill="F5F5F5"/>
-        <w:spacing w:after="0" w:line="240" w:lineRule="auto"/>
-      </w:pPr>
-      <w:r>
-        <w:rPr>
-          <w:rFonts w:ascii="Consolas" w:hAnsi="Consolas"/>
-          <w:color w:val="333333"/>
-          <w:sz w:val="18"/>
-        </w:rPr>
+        <w:t xml:space="preserve">  "school_averages": {</w:t>
+      </w:r>
+    </w:p>
+    <w:p>
+      <w:pPr>
+        <w:shd w:val="clear" w:color="auto" w:fill="F5F5F5"/>
+        <w:spacing w:after="0" w:line="240" w:lineRule="auto"/>
+      </w:pPr>
+      <w:r>
+        <w:t xml:space="preserve">    "avg_login_days": 12.5,</w:t>
+      </w:r>
+    </w:p>
+    <w:p>
+      <w:pPr>
+        <w:shd w:val="clear" w:color="auto" w:fill="F5F5F5"/>
+        <w:spacing w:after="0" w:line="240" w:lineRule="auto"/>
+      </w:pPr>
+      <w:r>
+        <w:t xml:space="preserve">    "avg_completion_rate": 0.65,</w:t>
+      </w:r>
+    </w:p>
+    <w:p>
+      <w:pPr>
+        <w:shd w:val="clear" w:color="auto" w:fill="F5F5F5"/>
+        <w:spacing w:after="0" w:line="240" w:lineRule="auto"/>
+      </w:pPr>
+      <w:r>
+        <w:t xml:space="preserve">    "active_student_count": 10</w:t>
+      </w:r>
+    </w:p>
+    <w:p>
+      <w:pPr>
+        <w:shd w:val="clear" w:color="auto" w:fill="F5F5F5"/>
+        <w:spacing w:after="0" w:line="240" w:lineRule="auto"/>
+      </w:pPr>
+      <w:r>
         <w:t xml:space="preserve">  },</w:t>
       </w:r>
     </w:p>
@@ -20957,53 +20887,15 @@
         <w:spacing w:after="0" w:line="240" w:lineRule="auto"/>
       </w:pPr>
       <w:r>
-        <w:rPr>
-          <w:rFonts w:ascii="Consolas" w:hAnsi="Consolas"/>
-          <w:color w:val="333333"/>
-          <w:sz w:val="18"/>
-        </w:rPr>
-        <w:t xml:space="preserve">  "</w:t>
-      </w:r>
-      <w:proofErr w:type="spellStart"/>
-      <w:proofErr w:type="gramStart"/>
-      <w:r>
-        <w:rPr>
-          <w:rFonts w:ascii="Consolas" w:hAnsi="Consolas"/>
-          <w:color w:val="333333"/>
-          <w:sz w:val="18"/>
-        </w:rPr>
-        <w:t>student</w:t>
-      </w:r>
-      <w:proofErr w:type="gramEnd"/>
-      <w:r>
-        <w:rPr>
-          <w:rFonts w:ascii="Consolas" w:hAnsi="Consolas"/>
-          <w:color w:val="333333"/>
-          <w:sz w:val="18"/>
-        </w:rPr>
-        <w:t>_engagement</w:t>
-      </w:r>
-      <w:proofErr w:type="spellEnd"/>
-      <w:r>
-        <w:rPr>
-          <w:rFonts w:ascii="Consolas" w:hAnsi="Consolas"/>
-          <w:color w:val="333333"/>
-          <w:sz w:val="18"/>
-        </w:rPr>
-        <w:t>": [</w:t>
-      </w:r>
-    </w:p>
-    <w:p>
-      <w:pPr>
-        <w:shd w:val="clear" w:color="auto" w:fill="F5F5F5"/>
-        <w:spacing w:after="0" w:line="240" w:lineRule="auto"/>
-      </w:pPr>
-      <w:r>
-        <w:rPr>
-          <w:rFonts w:ascii="Consolas" w:hAnsi="Consolas"/>
-          <w:color w:val="333333"/>
-          <w:sz w:val="18"/>
-        </w:rPr>
+        <w:t xml:space="preserve">  "student_engagement": [</w:t>
+      </w:r>
+    </w:p>
+    <w:p>
+      <w:pPr>
+        <w:shd w:val="clear" w:color="auto" w:fill="F5F5F5"/>
+        <w:spacing w:after="0" w:line="240" w:lineRule="auto"/>
+      </w:pPr>
+      <w:r>
         <w:t xml:space="preserve">    {</w:t>
       </w:r>
     </w:p>
@@ -21013,194 +20905,69 @@
         <w:spacing w:after="0" w:line="240" w:lineRule="auto"/>
       </w:pPr>
       <w:r>
-        <w:rPr>
-          <w:rFonts w:ascii="Consolas" w:hAnsi="Consolas"/>
-          <w:color w:val="333333"/>
-          <w:sz w:val="18"/>
-        </w:rPr>
-        <w:t xml:space="preserve">      "</w:t>
-      </w:r>
-      <w:proofErr w:type="spellStart"/>
-      <w:proofErr w:type="gramStart"/>
-      <w:r>
-        <w:rPr>
-          <w:rFonts w:ascii="Consolas" w:hAnsi="Consolas"/>
-          <w:color w:val="333333"/>
-          <w:sz w:val="18"/>
-        </w:rPr>
-        <w:t>student</w:t>
-      </w:r>
-      <w:proofErr w:type="gramEnd"/>
-      <w:r>
-        <w:rPr>
-          <w:rFonts w:ascii="Consolas" w:hAnsi="Consolas"/>
-          <w:color w:val="333333"/>
-          <w:sz w:val="18"/>
-        </w:rPr>
-        <w:t>_id</w:t>
-      </w:r>
-      <w:proofErr w:type="spellEnd"/>
-      <w:r>
-        <w:rPr>
-          <w:rFonts w:ascii="Consolas" w:hAnsi="Consolas"/>
-          <w:color w:val="333333"/>
-          <w:sz w:val="18"/>
-        </w:rPr>
-        <w:t>": 3,</w:t>
-      </w:r>
-    </w:p>
-    <w:p>
-      <w:pPr>
-        <w:shd w:val="clear" w:color="auto" w:fill="F5F5F5"/>
-        <w:spacing w:after="0" w:line="240" w:lineRule="auto"/>
-      </w:pPr>
-      <w:r>
-        <w:rPr>
-          <w:rFonts w:ascii="Consolas" w:hAnsi="Consolas"/>
-          <w:color w:val="333333"/>
-          <w:sz w:val="18"/>
-        </w:rPr>
-        <w:t xml:space="preserve">      "name": "Alice Student",</w:t>
-      </w:r>
-    </w:p>
-    <w:p>
-      <w:pPr>
-        <w:shd w:val="clear" w:color="auto" w:fill="F5F5F5"/>
-        <w:spacing w:after="0" w:line="240" w:lineRule="auto"/>
-      </w:pPr>
-      <w:r>
-        <w:rPr>
-          <w:rFonts w:ascii="Consolas" w:hAnsi="Consolas"/>
-          <w:color w:val="333333"/>
-          <w:sz w:val="18"/>
-        </w:rPr>
-        <w:lastRenderedPageBreak/>
-        <w:t xml:space="preserve">      "</w:t>
-      </w:r>
-      <w:proofErr w:type="spellStart"/>
-      <w:proofErr w:type="gramStart"/>
-      <w:r>
-        <w:rPr>
-          <w:rFonts w:ascii="Consolas" w:hAnsi="Consolas"/>
-          <w:color w:val="333333"/>
-          <w:sz w:val="18"/>
-        </w:rPr>
-        <w:t>login</w:t>
-      </w:r>
-      <w:proofErr w:type="gramEnd"/>
-      <w:r>
-        <w:rPr>
-          <w:rFonts w:ascii="Consolas" w:hAnsi="Consolas"/>
-          <w:color w:val="333333"/>
-          <w:sz w:val="18"/>
-        </w:rPr>
-        <w:t>_frequency</w:t>
-      </w:r>
-      <w:proofErr w:type="spellEnd"/>
-      <w:r>
-        <w:rPr>
-          <w:rFonts w:ascii="Consolas" w:hAnsi="Consolas"/>
-          <w:color w:val="333333"/>
-          <w:sz w:val="18"/>
-        </w:rPr>
-        <w:t>": 0.0,</w:t>
-      </w:r>
-    </w:p>
-    <w:p>
-      <w:pPr>
-        <w:shd w:val="clear" w:color="auto" w:fill="F5F5F5"/>
-        <w:spacing w:after="0" w:line="240" w:lineRule="auto"/>
-      </w:pPr>
-      <w:r>
-        <w:rPr>
-          <w:rFonts w:ascii="Consolas" w:hAnsi="Consolas"/>
-          <w:color w:val="333333"/>
-          <w:sz w:val="18"/>
-        </w:rPr>
-        <w:t xml:space="preserve">      "</w:t>
-      </w:r>
-      <w:proofErr w:type="spellStart"/>
-      <w:proofErr w:type="gramStart"/>
-      <w:r>
-        <w:rPr>
-          <w:rFonts w:ascii="Consolas" w:hAnsi="Consolas"/>
-          <w:color w:val="333333"/>
-          <w:sz w:val="18"/>
-        </w:rPr>
-        <w:t>content</w:t>
-      </w:r>
-      <w:proofErr w:type="gramEnd"/>
-      <w:r>
-        <w:rPr>
-          <w:rFonts w:ascii="Consolas" w:hAnsi="Consolas"/>
-          <w:color w:val="333333"/>
-          <w:sz w:val="18"/>
-        </w:rPr>
-        <w:t>_interaction</w:t>
-      </w:r>
-      <w:proofErr w:type="spellEnd"/>
-      <w:r>
-        <w:rPr>
-          <w:rFonts w:ascii="Consolas" w:hAnsi="Consolas"/>
-          <w:color w:val="333333"/>
-          <w:sz w:val="18"/>
-        </w:rPr>
-        <w:t>": 0.0,</w:t>
-      </w:r>
-    </w:p>
-    <w:p>
-      <w:pPr>
-        <w:shd w:val="clear" w:color="auto" w:fill="F5F5F5"/>
-        <w:spacing w:after="0" w:line="240" w:lineRule="auto"/>
-      </w:pPr>
-      <w:r>
-        <w:rPr>
-          <w:rFonts w:ascii="Consolas" w:hAnsi="Consolas"/>
-          <w:color w:val="333333"/>
-          <w:sz w:val="18"/>
-        </w:rPr>
-        <w:t xml:space="preserve">      "</w:t>
-      </w:r>
-      <w:proofErr w:type="spellStart"/>
-      <w:proofErr w:type="gramStart"/>
-      <w:r>
-        <w:rPr>
-          <w:rFonts w:ascii="Consolas" w:hAnsi="Consolas"/>
-          <w:color w:val="333333"/>
-          <w:sz w:val="18"/>
-        </w:rPr>
-        <w:t>assignment</w:t>
-      </w:r>
-      <w:proofErr w:type="gramEnd"/>
-      <w:r>
-        <w:rPr>
-          <w:rFonts w:ascii="Consolas" w:hAnsi="Consolas"/>
-          <w:color w:val="333333"/>
-          <w:sz w:val="18"/>
-        </w:rPr>
-        <w:t>_completion</w:t>
-      </w:r>
-      <w:proofErr w:type="spellEnd"/>
-      <w:r>
-        <w:rPr>
-          <w:rFonts w:ascii="Consolas" w:hAnsi="Consolas"/>
-          <w:color w:val="333333"/>
-          <w:sz w:val="18"/>
-        </w:rPr>
-        <w:t>": 0.0</w:t>
-      </w:r>
-    </w:p>
-    <w:p>
-      <w:pPr>
-        <w:shd w:val="clear" w:color="auto" w:fill="F5F5F5"/>
-        <w:spacing w:after="0" w:line="240" w:lineRule="auto"/>
-      </w:pPr>
-      <w:r>
-        <w:rPr>
-          <w:rFonts w:ascii="Consolas" w:hAnsi="Consolas"/>
-          <w:color w:val="333333"/>
-          <w:sz w:val="18"/>
-        </w:rPr>
+        <w:t xml:space="preserve">      "student_id": 4,</w:t>
+      </w:r>
+    </w:p>
+    <w:p>
+      <w:pPr>
+        <w:shd w:val="clear" w:color="auto" w:fill="F5F5F5"/>
+        <w:spacing w:after="0" w:line="240" w:lineRule="auto"/>
+      </w:pPr>
+      <w:r>
+        <w:t xml:space="preserve">      "student_name": "Student 1",</w:t>
+      </w:r>
+    </w:p>
+    <w:p>
+      <w:pPr>
+        <w:shd w:val="clear" w:color="auto" w:fill="F5F5F5"/>
+        <w:spacing w:after="0" w:line="240" w:lineRule="auto"/>
+      </w:pPr>
+      <w:r>
+        <w:t xml:space="preserve">      "login_days_last_30": 15,</w:t>
+      </w:r>
+    </w:p>
+    <w:p>
+      <w:pPr>
+        <w:shd w:val="clear" w:color="auto" w:fill="F5F5F5"/>
+        <w:spacing w:after="0" w:line="240" w:lineRule="auto"/>
+      </w:pPr>
+      <w:r>
+        <w:t xml:space="preserve">      "activities_completed": 20,</w:t>
+      </w:r>
+    </w:p>
+    <w:p>
+      <w:pPr>
+        <w:shd w:val="clear" w:color="auto" w:fill="F5F5F5"/>
+        <w:spacing w:after="0" w:line="240" w:lineRule="auto"/>
+      </w:pPr>
+      <w:r>
+        <w:t xml:space="preserve">      "total_activities": 30,</w:t>
+      </w:r>
+    </w:p>
+    <w:p>
+      <w:pPr>
+        <w:shd w:val="clear" w:color="auto" w:fill="F5F5F5"/>
+        <w:spacing w:after="0" w:line="240" w:lineRule="auto"/>
+      </w:pPr>
+      <w:r>
+        <w:t xml:space="preserve">      "completion_rate": 0.67,</w:t>
+      </w:r>
+    </w:p>
+    <w:p>
+      <w:pPr>
+        <w:shd w:val="clear" w:color="auto" w:fill="F5F5F5"/>
+        <w:spacing w:after="0" w:line="240" w:lineRule="auto"/>
+      </w:pPr>
+      <w:r>
+        <w:t xml:space="preserve">      "last_active_at": "2026-03-22T10:00:00+00:00"</w:t>
+      </w:r>
+    </w:p>
+    <w:p>
+      <w:pPr>
+        <w:shd w:val="clear" w:color="auto" w:fill="F5F5F5"/>
+        <w:spacing w:after="0" w:line="240" w:lineRule="auto"/>
+      </w:pPr>
+      <w:r>
         <w:t xml:space="preserve">    }</w:t>
       </w:r>
     </w:p>
@@ -21210,25 +20977,15 @@
         <w:spacing w:after="0" w:line="240" w:lineRule="auto"/>
       </w:pPr>
       <w:r>
-        <w:rPr>
-          <w:rFonts w:ascii="Consolas" w:hAnsi="Consolas"/>
-          <w:color w:val="333333"/>
-          <w:sz w:val="18"/>
-        </w:rPr>
-        <w:t xml:space="preserve">  ]</w:t>
-      </w:r>
-    </w:p>
-    <w:p>
-      <w:pPr>
-        <w:shd w:val="clear" w:color="auto" w:fill="F5F5F5"/>
-        <w:spacing w:after="0" w:line="240" w:lineRule="auto"/>
-      </w:pPr>
-      <w:r>
-        <w:rPr>
-          <w:rFonts w:ascii="Consolas" w:hAnsi="Consolas"/>
-          <w:color w:val="333333"/>
-          <w:sz w:val="18"/>
-        </w:rPr>
+        <w:t>  ]</w:t>
+      </w:r>
+    </w:p>
+    <w:p>
+      <w:pPr>
+        <w:shd w:val="clear" w:color="auto" w:fill="F5F5F5"/>
+        <w:spacing w:after="0" w:line="240" w:lineRule="auto"/>
+      </w:pPr>
+      <w:r>
         <w:t>}</w:t>
       </w:r>
     </w:p>
@@ -21237,11 +20994,9 @@
         <w:rPr>
           <w:b/>
         </w:rPr>
-        <w:t>Integration dependency:</w:t>
-      </w:r>
-      <w:r>
-        <w:t xml:space="preserve"> All engagement values come from a mock progress provider (</w:t>
-      </w:r>
+        <w:t>Integration dependency: All engagement values come from a mock progress provider (MockStudentProgressProvider implementing StudentProgressProviderInterface) and are 0.0. Real engagement metrics (login frequency, activity completion, and last-active timestamps) depend on Team Papa's Course Service. See the team-specific integration requirement documents for details.</w:t>
+      </w:r>
+      <w:r/>
       <w:proofErr w:type="spellStart"/>
       <w:r>
         <w:rPr>
@@ -21249,12 +21004,9 @@
           <w:color w:val="444444"/>
           <w:sz w:val="19"/>
         </w:rPr>
-        <w:t>MockStudentProgressProvider</w:t>
       </w:r>
       <w:proofErr w:type="spellEnd"/>
-      <w:r>
-        <w:t xml:space="preserve"> implementing </w:t>
-      </w:r>
+      <w:r/>
       <w:proofErr w:type="spellStart"/>
       <w:r>
         <w:rPr>
@@ -21262,23 +21014,17 @@
           <w:color w:val="444444"/>
           <w:sz w:val="19"/>
         </w:rPr>
-        <w:t>StudentProgressProviderInterface</w:t>
       </w:r>
       <w:proofErr w:type="spellEnd"/>
-      <w:r>
-        <w:t xml:space="preserve">) and are </w:t>
-      </w:r>
+      <w:r/>
       <w:r>
         <w:rPr>
           <w:rFonts w:ascii="Consolas" w:hAnsi="Consolas"/>
           <w:color w:val="444444"/>
           <w:sz w:val="19"/>
         </w:rPr>
-        <w:t>0.0</w:t>
-      </w:r>
-      <w:r>
-        <w:t>. Real engagement metrics (login frequency, content interaction, assignment completion) depend on Team Papa's Course Service. See the team-specific integration requirement documents for details.</w:t>
-      </w:r>
+      </w:r>
+      <w:r/>
     </w:p>
     <w:p>
       <w:pPr>
@@ -21364,7 +21110,7 @@
         <w:rPr>
           <w:b/>
         </w:rPr>
-        <w:t>Response (200):</w:t>
+        <w:t>Example response (200):</w:t>
       </w:r>
     </w:p>
     <w:p>
@@ -21963,7 +21709,7 @@
         <w:rPr>
           <w:b/>
         </w:rPr>
-        <w:t>Response (200):</w:t>
+        <w:t>Example response (200):</w:t>
       </w:r>
     </w:p>
     <w:p>
@@ -22055,7 +21801,7 @@
         <w:rPr>
           <w:b/>
         </w:rPr>
-        <w:t>Error (422) -- Unknown widget type:</w:t>
+        <w:t>Example error (422) -- Unknown widget type:</w:t>
       </w:r>
     </w:p>
     <w:p>

</xml_diff>

<commit_message>
Replace parent_of FK with parent_student_links many-to-many table
Aligns parent-child data model with Karl's Role B workpack canonical schema.
The previous single FK (parent_of on users) only supported one-to-one
relationships. The new parent_student_links join table supports multiple
children per parent and multiple parents per student.

Changes across all 3 services:
- Migration: create parent_student_links table instead of adding parent_of column
- Seeders: parent linked via join table rows (Parent 1 -> Students 1, 2)
- User models: removed parent_of from fillable
- Controllers: parent auth guards now query parent_student_links
- EnrolmentService: added student_ids array filter for parent overview
- DashboardTest: updated parent test helper
- API-CONTRACT.docx bumped to D2.6 with updated parent model references
</commit_message>
<xml_diff>
--- a/API-CONTRACT.docx
+++ b/API-CONTRACT.docx
@@ -67,7 +67,7 @@
     </w:p>
     <w:p>
       <w:r>
-        <w:t>Current version: D2.5 (March 2026).</w:t>
+        <w:t>Current version: D2.6 (March 2026).</w:t>
       </w:r>
     </w:p>
     <w:p>
@@ -690,11 +690,11 @@
       </w:r>
       <w:proofErr w:type="spellStart"/>
       <w:r>
-        <w:t>parent_of</w:t>
+        <w:t>parent_student_links</w:t>
       </w:r>
       <w:proofErr w:type="spellEnd"/>
       <w:r>
-        <w:t xml:space="preserve"> column. Students and parents receive 403 Forbidden on write attempts.</w:t>
+        <w:t xml:space="preserve"> table (many-to-many). Students and parents receive 403 Forbidden on write attempts.</w:t>
       </w:r>
     </w:p>
     <w:p>
@@ -767,24 +767,16 @@
         <w:pStyle w:val="ListBullet"/>
       </w:pPr>
       <w:r>
-        <w:t xml:space="preserve">Parents can only access their linked child's data. The same auto-filter applies, using the </w:t>
+        <w:t>Parents can only access their linked child's data. The same auto-filter applies, via the parent_student_links table (many-to-many join table per Karl Role B workpack).</w:t>
       </w:r>
       <w:proofErr w:type="spellStart"/>
-      <w:r>
-        <w:t>parent_of</w:t>
-      </w:r>
+      <w:r/>
       <w:proofErr w:type="spellEnd"/>
-      <w:r>
-        <w:t xml:space="preserve"> relationship (current: single FK; production: </w:t>
-      </w:r>
+      <w:r/>
       <w:proofErr w:type="spellStart"/>
-      <w:r>
-        <w:t>parent_student_links</w:t>
-      </w:r>
+      <w:r/>
       <w:proofErr w:type="spellEnd"/>
-      <w:r>
-        <w:t xml:space="preserve"> table).</w:t>
-      </w:r>
+      <w:r/>
     </w:p>
     <w:p>
       <w:pPr>
@@ -19297,42 +19289,26 @@
     </w:p>
     <w:p>
       <w:r>
-        <w:t xml:space="preserve">Returns detailed data for a single student including enrolments, progress, credentials, and curriculum mapping. Accessible by all roles, but students can only view their own record (403 if </w:t>
+        <w:t>Returns detailed data for a single student including enrolments, progress, credentials, and curriculum mapping. Accessible by all roles, but students can only view their own record (403 if studentId != self) and parents can only view their linked child (403 if no parent_student_links row exists).</w:t>
       </w:r>
       <w:proofErr w:type="spellStart"/>
       <w:proofErr w:type="gramStart"/>
-      <w:r>
-        <w:t>studentId</w:t>
-      </w:r>
+      <w:r/>
       <w:proofErr w:type="spellEnd"/>
-      <w:r>
-        <w:t xml:space="preserve"> !</w:t>
-      </w:r>
+      <w:r/>
       <w:proofErr w:type="gramEnd"/>
-      <w:r>
-        <w:t xml:space="preserve">= self) and parents can only view their linked child (403 if </w:t>
-      </w:r>
+      <w:r/>
       <w:proofErr w:type="spellStart"/>
       <w:proofErr w:type="gramStart"/>
-      <w:r>
-        <w:t>studentId</w:t>
-      </w:r>
+      <w:r/>
       <w:proofErr w:type="spellEnd"/>
-      <w:r>
-        <w:t xml:space="preserve"> !</w:t>
-      </w:r>
+      <w:r/>
       <w:proofErr w:type="gramEnd"/>
-      <w:r>
-        <w:t xml:space="preserve">= </w:t>
-      </w:r>
+      <w:r/>
       <w:proofErr w:type="spellStart"/>
-      <w:r>
-        <w:t>parent_of</w:t>
-      </w:r>
+      <w:r/>
       <w:proofErr w:type="spellEnd"/>
-      <w:r>
-        <w:t>).</w:t>
-      </w:r>
+      <w:r/>
     </w:p>
     <w:p>
       <w:r>
@@ -22185,56 +22161,32 @@
         <w:pStyle w:val="ListBullet"/>
       </w:pPr>
       <w:r>
-        <w:t xml:space="preserve">Parent-child relationships -- Team Quebec. </w:t>
+        <w:t>Parent-child relationships -- Team Quebec. Workpacks confirm: canonical schema uses parent_student_links table (parent_id, student_id), not a single FK. Delta now implements the canonical parent_student_links table with many-to-many support. All parent authorization guards query this table directly.</w:t>
       </w:r>
       <w:proofErr w:type="spellStart"/>
-      <w:r>
-        <w:t>Workpacks</w:t>
-      </w:r>
+      <w:r/>
       <w:proofErr w:type="spellEnd"/>
-      <w:r>
-        <w:t xml:space="preserve"> </w:t>
-      </w:r>
+      <w:r/>
       <w:proofErr w:type="gramStart"/>
-      <w:r>
-        <w:t>confirm:</w:t>
-      </w:r>
+      <w:r/>
       <w:proofErr w:type="gramEnd"/>
-      <w:r>
-        <w:t xml:space="preserve"> canonical schema uses </w:t>
-      </w:r>
+      <w:r/>
       <w:proofErr w:type="spellStart"/>
-      <w:r>
-        <w:t>parent_student_links</w:t>
-      </w:r>
+      <w:r/>
       <w:proofErr w:type="spellEnd"/>
-      <w:r>
-        <w:t xml:space="preserve"> table (</w:t>
-      </w:r>
+      <w:r/>
       <w:proofErr w:type="spellStart"/>
-      <w:r>
-        <w:t>parent_id</w:t>
-      </w:r>
+      <w:r/>
       <w:proofErr w:type="spellEnd"/>
-      <w:r>
-        <w:t xml:space="preserve">, </w:t>
-      </w:r>
+      <w:r/>
       <w:proofErr w:type="spellStart"/>
-      <w:r>
-        <w:t>student_id</w:t>
-      </w:r>
+      <w:r/>
       <w:proofErr w:type="spellEnd"/>
-      <w:r>
-        <w:t xml:space="preserve">), not a single FK. Delta's current </w:t>
-      </w:r>
+      <w:r/>
       <w:proofErr w:type="spellStart"/>
-      <w:r>
-        <w:t>parent_of</w:t>
-      </w:r>
+      <w:r/>
       <w:proofErr w:type="spellEnd"/>
-      <w:r>
-        <w:t xml:space="preserve"> column is a temporary simplification. Quebec owns the link table; Delta will migrate to querying this table when real auth is integrated.</w:t>
-      </w:r>
+      <w:r/>
     </w:p>
     <w:p>
       <w:pPr>

</xml_diff>

<commit_message>
Add HttpCredentialDataProvider for dashboard and enrolment services
Implements the HTTP strategy provider for Karl's Credential Engine in
both services, wired via AUTH_MODE toggle in AppServiceProvider. Adds
credential service URL config. Updates API contract to D2.7 reflecting
the new provider availability.
</commit_message>
<xml_diff>
--- a/API-CONTRACT.docx
+++ b/API-CONTRACT.docx
@@ -67,7 +67,7 @@
     </w:p>
     <w:p>
       <w:r>
-        <w:t>Current version: D2.6 (March 2026).</w:t>
+        <w:t>Current version: D2.7 (March 2026).</w:t>
       </w:r>
     </w:p>
     <w:p>
@@ -148,7 +148,7 @@
         <w:pStyle w:val="ListBullet"/>
       </w:pPr>
       <w:r>
-        <w:t>Sample credential data: 2 earned + 1 in-progress per student (mock)</w:t>
+        <w:t>Sample credential data: 2 earned + 1 in-progress per student (mock mode); HTTP mode calls Karl’s Credential Engine</w:t>
       </w:r>
     </w:p>
     <w:p>
@@ -9662,53 +9662,7 @@
     </w:p>
     <w:p>
       <w:r>
-        <w:rPr>
-          <w:b/>
-        </w:rPr>
-        <w:lastRenderedPageBreak/>
-        <w:t>Integration dependency: The credentials field is populated by a mock credential data provider (</w:t>
-      </w:r>
-      <w:proofErr w:type="spellStart"/>
-      <w:r>
-        <w:rPr>
-          <w:b/>
-        </w:rPr>
-        <w:t>MockCredentialDataProvider</w:t>
-      </w:r>
-      <w:proofErr w:type="spellEnd"/>
-      <w:r>
-        <w:rPr>
-          <w:b/>
-        </w:rPr>
-        <w:t xml:space="preserve"> implementing </w:t>
-      </w:r>
-      <w:proofErr w:type="spellStart"/>
-      <w:r>
-        <w:rPr>
-          <w:b/>
-        </w:rPr>
-        <w:t>CredentialDataProviderInterface</w:t>
-      </w:r>
-      <w:proofErr w:type="spellEnd"/>
-      <w:r>
-        <w:rPr>
-          <w:b/>
-        </w:rPr>
-        <w:t xml:space="preserve">). It returns empty/zero data. Real credential data will come from Karl's credential engine. See the team-specific integration requirement documents for details. Student grades (8-12) are now seeded in the </w:t>
-      </w:r>
-      <w:proofErr w:type="gramStart"/>
-      <w:r>
-        <w:rPr>
-          <w:b/>
-        </w:rPr>
-        <w:t>users</w:t>
-      </w:r>
-      <w:proofErr w:type="gramEnd"/>
-      <w:r>
-        <w:rPr>
-          <w:b/>
-        </w:rPr>
-        <w:t xml:space="preserve"> table.</w:t>
+        <w:t>Integration dependency: The credentials field is populated via the CredentialDataProviderInterface (Strategy pattern). In mock mode (AUTH_MODE=mock), MockCredentialDataProvider returns sample data. In HTTP mode (AUTH_MODE=http), HttpCredentialDataProvider calls Karl’s Credential Engine API. Student grades (8-12) are now seeded in the users table.</w:t>
       </w:r>
     </w:p>
     <w:p>
@@ -20195,50 +20149,7 @@
         <w:pStyle w:val="ListBullet"/>
       </w:pPr>
       <w:r>
-        <w:rPr>
-          <w:rFonts w:ascii="Consolas" w:hAnsi="Consolas"/>
-          <w:sz w:val="19"/>
-        </w:rPr>
-        <w:t>credentials</w:t>
-      </w:r>
-      <w:r>
-        <w:t xml:space="preserve"> and </w:t>
-      </w:r>
-      <w:proofErr w:type="spellStart"/>
-      <w:r>
-        <w:rPr>
-          <w:rFonts w:ascii="Consolas" w:hAnsi="Consolas"/>
-          <w:sz w:val="19"/>
-        </w:rPr>
-        <w:t>curriculum_mapping</w:t>
-      </w:r>
-      <w:proofErr w:type="spellEnd"/>
-      <w:r>
-        <w:t xml:space="preserve"> come from a mock provider (</w:t>
-      </w:r>
-      <w:proofErr w:type="spellStart"/>
-      <w:r>
-        <w:rPr>
-          <w:rFonts w:ascii="Consolas" w:hAnsi="Consolas"/>
-          <w:sz w:val="19"/>
-        </w:rPr>
-        <w:t>MockCredentialDataProvider</w:t>
-      </w:r>
-      <w:proofErr w:type="spellEnd"/>
-      <w:r>
-        <w:t xml:space="preserve"> implementing </w:t>
-      </w:r>
-      <w:proofErr w:type="spellStart"/>
-      <w:r>
-        <w:rPr>
-          <w:rFonts w:ascii="Consolas" w:hAnsi="Consolas"/>
-          <w:sz w:val="19"/>
-        </w:rPr>
-        <w:t>CredentialDataProviderInterface</w:t>
-      </w:r>
-      <w:proofErr w:type="spellEnd"/>
-      <w:r>
-        <w:t>) and return empty arrays. Real data depends on Karl's credential engine.</w:t>
+        <w:t>credentials and curriculum_mapping are provided via the CredentialDataProviderInterface (Strategy pattern). In mock mode, MockCredentialDataProvider returns sample data. In HTTP mode, HttpCredentialDataProvider calls Karl’s Credential Engine. Ideal endpoints: GET /api/credentials/students/{studentId} and GET /api/credentials/students/{studentId}/curriculum-mapping.</w:t>
       </w:r>
     </w:p>
     <w:p>
@@ -22242,15 +22153,39 @@
         <w:pStyle w:val="ListBullet"/>
       </w:pPr>
       <w:r>
-        <w:t xml:space="preserve">Credential engine (real credentials) -- Karl (Role B). Delta uses </w:t>
+        <w:t>Credential engine (real credentials) -- Karl (Role B). Delta has HttpCredentialDataProvider ready; currently uses MockCredentialDataProvider when AUTH_MODE=mock.</w:t>
+      </w:r>
+    </w:p>
+    <w:p>
+      <w:pPr>
+        <w:pStyle w:val="ListBullet"/>
+      </w:pPr>
+      <w:r>
+        <w:t>Gamification (streaks, XP, badges) -- TBD (not assigned to any team).</w:t>
+      </w:r>
+    </w:p>
+    <w:p>
+      <w:pPr>
+        <w:pStyle w:val="ListBullet"/>
+      </w:pPr>
+      <w:r>
+        <w:t xml:space="preserve">Ventures / </w:t>
       </w:r>
       <w:proofErr w:type="spellStart"/>
       <w:r>
-        <w:t>MockCredentialDataProvider</w:t>
+        <w:t>LaunchPad</w:t>
       </w:r>
       <w:proofErr w:type="spellEnd"/>
       <w:r>
-        <w:t>.</w:t>
+        <w:t xml:space="preserve"> data -- Team Quebec (</w:t>
+      </w:r>
+      <w:proofErr w:type="spellStart"/>
+      <w:r>
+        <w:t>LaunchPad</w:t>
+      </w:r>
+      <w:proofErr w:type="spellEnd"/>
+      <w:r>
+        <w:t>).</w:t>
       </w:r>
     </w:p>
     <w:p>
@@ -22258,31 +22193,57 @@
         <w:pStyle w:val="ListBullet"/>
       </w:pPr>
       <w:r>
-        <w:t>Gamification (streaks, XP, badges) -- TBD (not assigned to any team).</w:t>
+        <w:t>Messaging and notifications -- Team Quebec (</w:t>
+      </w:r>
+      <w:proofErr w:type="spellStart"/>
+      <w:r>
+        <w:t>ConnectHub</w:t>
+      </w:r>
+      <w:proofErr w:type="spellEnd"/>
+      <w:r>
+        <w:t>).</w:t>
+      </w:r>
+    </w:p>
+    <w:p>
+      <w:pPr>
+        <w:pStyle w:val="Heading3"/>
+      </w:pPr>
+      <w:r>
+        <w:t>Strategy Pattern -- Ready for Swap</w:t>
+      </w:r>
+    </w:p>
+    <w:p>
+      <w:r>
+        <w:t xml:space="preserve">Delta uses the Strategy pattern for all external dependencies. When your real service is ready, swap the binding in </w:t>
+      </w:r>
+      <w:proofErr w:type="spellStart"/>
+      <w:r>
+        <w:t>AppServiceProvider</w:t>
+      </w:r>
+      <w:proofErr w:type="spellEnd"/>
+      <w:r>
+        <w:t xml:space="preserve"> -- no controller code changes needed:</w:t>
       </w:r>
     </w:p>
     <w:p>
       <w:pPr>
         <w:pStyle w:val="ListBullet"/>
       </w:pPr>
-      <w:r>
-        <w:t xml:space="preserve">Ventures / </w:t>
-      </w:r>
       <w:proofErr w:type="spellStart"/>
       <w:r>
-        <w:t>LaunchPad</w:t>
+        <w:t>CourseDataProviderInterface</w:t>
       </w:r>
       <w:proofErr w:type="spellEnd"/>
       <w:r>
-        <w:t xml:space="preserve"> data -- Team Quebec (</w:t>
+        <w:t xml:space="preserve">: </w:t>
       </w:r>
       <w:proofErr w:type="spellStart"/>
       <w:r>
-        <w:t>LaunchPad</w:t>
+        <w:t>MockCourseDataProvider</w:t>
       </w:r>
       <w:proofErr w:type="spellEnd"/>
       <w:r>
-        <w:t>).</w:t>
+        <w:t xml:space="preserve"> (5 courses) -&gt; real HTTP client to Papa (Experience Service)</w:t>
       </w:r>
     </w:p>
     <w:p>
@@ -22290,78 +22251,7 @@
         <w:pStyle w:val="ListBullet"/>
       </w:pPr>
       <w:r>
-        <w:t>Messaging and notifications -- Team Quebec (</w:t>
-      </w:r>
-      <w:proofErr w:type="spellStart"/>
-      <w:r>
-        <w:t>ConnectHub</w:t>
-      </w:r>
-      <w:proofErr w:type="spellEnd"/>
-      <w:r>
-        <w:t>).</w:t>
-      </w:r>
-    </w:p>
-    <w:p>
-      <w:pPr>
-        <w:pStyle w:val="Heading3"/>
-      </w:pPr>
-      <w:r>
-        <w:t>Strategy Pattern -- Ready for Swap</w:t>
-      </w:r>
-    </w:p>
-    <w:p>
-      <w:r>
-        <w:t xml:space="preserve">Delta uses the Strategy pattern for all external dependencies. When your real service is ready, swap the binding in </w:t>
-      </w:r>
-      <w:proofErr w:type="spellStart"/>
-      <w:r>
-        <w:t>AppServiceProvider</w:t>
-      </w:r>
-      <w:proofErr w:type="spellEnd"/>
-      <w:r>
-        <w:t xml:space="preserve"> -- no controller code changes needed:</w:t>
-      </w:r>
-    </w:p>
-    <w:p>
-      <w:pPr>
-        <w:pStyle w:val="ListBullet"/>
-      </w:pPr>
-      <w:proofErr w:type="spellStart"/>
-      <w:r>
-        <w:t>CourseDataProviderInterface</w:t>
-      </w:r>
-      <w:proofErr w:type="spellEnd"/>
-      <w:r>
-        <w:t xml:space="preserve">: </w:t>
-      </w:r>
-      <w:proofErr w:type="spellStart"/>
-      <w:r>
-        <w:t>MockCourseDataProvider</w:t>
-      </w:r>
-      <w:proofErr w:type="spellEnd"/>
-      <w:r>
-        <w:t xml:space="preserve"> (5 courses) -&gt; real HTTP client to Papa (Experience Service)</w:t>
-      </w:r>
-    </w:p>
-    <w:p>
-      <w:pPr>
-        <w:pStyle w:val="ListBullet"/>
-      </w:pPr>
-      <w:proofErr w:type="spellStart"/>
-      <w:r>
-        <w:t>CredentialDataProviderInterface</w:t>
-      </w:r>
-      <w:proofErr w:type="spellEnd"/>
-      <w:r>
-        <w:t xml:space="preserve">: </w:t>
-      </w:r>
-      <w:proofErr w:type="spellStart"/>
-      <w:r>
-        <w:t>MockCredentialDataProvider</w:t>
-      </w:r>
-      <w:proofErr w:type="spellEnd"/>
-      <w:r>
-        <w:t xml:space="preserve"> (3 credentials) -&gt; real HTTP client to Karl (Enrolment + Dashboard)</w:t>
+        <w:t>CredentialDataProviderInterface: MockCredentialDataProvider (3 credentials) / HttpCredentialDataProvider (HTTP ready) → Karl’s Credential Engine (Enrolment + Dashboard)</w:t>
       </w:r>
     </w:p>
     <w:p>

</xml_diff>

<commit_message>
Fix API contract: user count, parent links, grade field, LaunchPad
- User count: 14 -> 16 (was missing hatchloom_teacher and hatchloom_admin)
- Parent links: linked to student 4 -> linked to students 4 and 5
- Student detail example: grade null -> grade 10 (grades are seeded)
- Strategy swap section: add missing LaunchPadDataProviderInterface
- README: fix cohort count 5 -> 4 (no Cohort E in seeder)
- Version bump: D2.7 -> D2.8
</commit_message>
<xml_diff>
--- a/API-CONTRACT.docx
+++ b/API-CONTRACT.docx
@@ -67,7 +67,7 @@
     </w:p>
     <w:p>
       <w:r>
-        <w:t>Current version: D2.7 (March 2026).</w:t>
+        <w:t>Current version: D2.8 (March 2026).</w:t>
       </w:r>
     </w:p>
     <w:p>
@@ -96,7 +96,7 @@
         <w:pStyle w:val="ListBullet"/>
       </w:pPr>
       <w:r>
-        <w:t>14 users: 1 admin (id=1), 2 teachers (id=2,3), 10 students (id=4-13, grades 8-12), 1 parent (id=14, linked to student id=4)</w:t>
+        <w:t>16 users: 1 admin (id=1), 2 teachers (id=2,3), 10 students (id=4-13, grades 8-12), 1 parent (id=14, linked to students 4 and 5), 2 platform staff (id=15 hatchloom_teacher, id=16 hatchloom_admin)</w:t>
       </w:r>
     </w:p>
     <w:p>
@@ -9171,12 +9171,7 @@
         <w:spacing w:after="0" w:line="240" w:lineRule="auto"/>
       </w:pPr>
       <w:r>
-        <w:rPr>
-          <w:rFonts w:ascii="Consolas" w:hAnsi="Consolas"/>
-          <w:color w:val="333333"/>
-          <w:sz w:val="18"/>
-        </w:rPr>
-        <w:t xml:space="preserve">    "grade": null</w:t>
+        <w:t xml:space="preserve">    "grade": 10</w:t>
       </w:r>
     </w:p>
     <w:p>
@@ -22258,21 +22253,10 @@
       <w:pPr>
         <w:pStyle w:val="ListBullet"/>
       </w:pPr>
-      <w:proofErr w:type="spellStart"/>
-      <w:r>
-        <w:t>StudentProgressProviderInterface</w:t>
-      </w:r>
-      <w:proofErr w:type="spellEnd"/>
-      <w:r>
-        <w:t xml:space="preserve">: </w:t>
-      </w:r>
-      <w:proofErr w:type="spellStart"/>
-      <w:r>
-        <w:t>MockStudentProgressProvider</w:t>
-      </w:r>
-      <w:proofErr w:type="spellEnd"/>
-      <w:r>
-        <w:t xml:space="preserve"> (random metrics) -&gt; real aggregation from Papa + Karl (Dashboard)</w:t>
+      <w:r>
+        <w:t>StudentProgressProviderInterface: MockStudentProgressProvider (random metrics) -&gt; real aggregation from Papa + Karl (Dashboard)</w:t>
+        <w:br/>
+        <w:t>LaunchPadDataProviderInterface: MockLaunchPadDataProvider (sample ventures) / HttpLaunchPadDataProvider (HTTP ready) → Quebec’s LaunchPad Service (Dashboard)</w:t>
       </w:r>
     </w:p>
     <w:p>

</xml_diff>

<commit_message>
Fix role permissions, cross-school validation, and update docs
- Allow teachers to create/edit/archive experiences and manage cohorts
  (create, update, activate, complete) per workpack requirements
- Keep enrol/remove students as admin-only operations
- Scope cohort validation to authenticated user's school (experience_id
  and teacher_id now checked against school_id via Rule::exists)
- Add 3 cross-school security tests for cohort operations
- Switch tests from DatabaseMigrations to RefreshDatabase with PG
  sequence resets for reliable ID-based mock auth
- Force AUTH_MODE=mock in phpunit.xml for test isolation
- Use force=false on DB settings in phpunit.xml so CI env vars
  take precedence over Docker-oriented defaults
- Update README and API-CONTRACT.docx to reflect actual permissions:
  dashboard overview is Admin/Teacher, experience students endpoints
  are All roles (scoped), courses endpoint is Admin/Teacher
</commit_message>
<xml_diff>
--- a/API-CONTRACT.docx
+++ b/API-CONTRACT.docx
@@ -67,7 +67,7 @@
     </w:p>
     <w:p>
       <w:r>
-        <w:t>Current version: D2.8 (March 2026).</w:t>
+        <w:t>Current version: D2.9 (April 2026).</w:t>
       </w:r>
     </w:p>
     <w:p>
@@ -670,31 +670,7 @@
         <w:pStyle w:val="ListBullet"/>
       </w:pPr>
       <w:r>
-        <w:t xml:space="preserve">Valid token mapping to a user with role </w:t>
-      </w:r>
-      <w:proofErr w:type="spellStart"/>
-      <w:r>
-        <w:t>school_teacher</w:t>
-      </w:r>
-      <w:proofErr w:type="spellEnd"/>
-      <w:r>
-        <w:t xml:space="preserve"> grants full read/write access to experiences and cohorts. Users with role </w:t>
-      </w:r>
-      <w:proofErr w:type="spellStart"/>
-      <w:r>
-        <w:t>school_admin</w:t>
-      </w:r>
-      <w:proofErr w:type="spellEnd"/>
-      <w:r>
-        <w:t xml:space="preserve"> have read access to all data and write access limited to enrolment operations (enrolling and removing students from cohorts). Students (role=student) have read-only access scoped to their own data. Parents (role=parent) have read-only access scoped to their linked child's data via the </w:t>
-      </w:r>
-      <w:proofErr w:type="spellStart"/>
-      <w:r>
-        <w:t>parent_student_links</w:t>
-      </w:r>
-      <w:proofErr w:type="spellEnd"/>
-      <w:r>
-        <w:t xml:space="preserve"> table (many-to-many). Students and parents receive 403 Forbidden on write attempts.</w:t>
+        <w:t>Valid token mapping to a user with role school_admin grants unrestricted access -- full read/write to all endpoints including enrolment operations (enrolling and removing students from cohorts). Users with role school_teacher have read/write access to experiences and cohorts (create, update, activate, complete) but cannot enrol or remove students (admin-only). Students (role=student) have read-only access scoped to their own data. Parents (role=parent) have read-only access scoped to their linked children's data via the parent_student_links table (many-to-many). Students and parents receive 403 Forbidden on write attempts.</w:t>
       </w:r>
     </w:p>
     <w:p>
@@ -820,23 +796,7 @@
         <w:pStyle w:val="ListBullet"/>
       </w:pPr>
       <w:r>
-        <w:t xml:space="preserve">School-wide dashboard endpoints (GET /dashboard, GET /dashboard/reporting/*, GET /dashboard/widgets/*) are restricted to </w:t>
-      </w:r>
-      <w:proofErr w:type="spellStart"/>
-      <w:r>
-        <w:t>school_admin</w:t>
-      </w:r>
-      <w:proofErr w:type="spellEnd"/>
-      <w:r>
-        <w:t xml:space="preserve"> and </w:t>
-      </w:r>
-      <w:proofErr w:type="spellStart"/>
-      <w:r>
-        <w:t>school_teacher</w:t>
-      </w:r>
-      <w:proofErr w:type="spellEnd"/>
-      <w:r>
-        <w:t xml:space="preserve"> roles only. Students and parents cannot access aggregated school data.</w:t>
+        <w:t>School-wide dashboard endpoints (GET /dashboard, GET /dashboard/reporting/*, GET /dashboard/widgets/*) are restricted to school_admin and school_teacher roles. Students and parents cannot access aggregated school data.</w:t>
       </w:r>
     </w:p>
     <w:p>

</xml_diff>

<commit_message>
Add experience_id to cohort_assignments in API contract
Document the experience_id field that the enrolment service
returns alongside experience_name in cohort_assignments arrays.
</commit_message>
<xml_diff>
--- a/API-CONTRACT.docx
+++ b/API-CONTRACT.docx
@@ -6376,6 +6376,11 @@
       </w:r>
     </w:p>
     <w:p>
+      <w:r>
+        <w:t xml:space="preserve">          "experience_id": 1,</w:t>
+      </w:r>
+    </w:p>
+    <w:p>
       <w:pPr>
         <w:shd w:val="clear" w:color="auto" w:fill="F5F5F5"/>
         <w:spacing w:after="0" w:line="240" w:lineRule="auto"/>
@@ -9258,6 +9263,11 @@
           <w:sz w:val="18"/>
         </w:rPr>
         <w:t>": "Spring 2026 Cohort A",</w:t>
+      </w:r>
+    </w:p>
+    <w:p>
+      <w:r>
+        <w:t xml:space="preserve">      "experience_id": 1,</w:t>
       </w:r>
     </w:p>
     <w:p>
@@ -19472,6 +19482,11 @@
           <w:sz w:val="18"/>
         </w:rPr>
         <w:t>": "Spring 2026 Cohort A",</w:t>
+      </w:r>
+    </w:p>
+    <w:p>
+      <w:r>
+        <w:t xml:space="preserve">      "experience_id": 1,</w:t>
       </w:r>
     </w:p>
     <w:p>

</xml_diff>